<commit_message>
Restore original subscription structure and simplify registration names
</commit_message>
<xml_diff>
--- a/output/documents/subscription-company.docx
+++ b/output/documents/subscription-company.docx
@@ -2,77 +2,106 @@
 <file path=word/document.xml><?xml version="1.0" encoding="utf-8"?>
 <w:document xmlns:wpc="http://schemas.microsoft.com/office/word/2010/wordprocessingCanvas" xmlns:mo="http://schemas.microsoft.com/office/mac/office/2008/main" xmlns:mc="http://schemas.openxmlformats.org/markup-compatibility/2006" xmlns:mv="urn:schemas-microsoft-com:mac:vml" xmlns:o="urn:schemas-microsoft-com:office:office" xmlns:r="http://schemas.openxmlformats.org/officeDocument/2006/relationships" xmlns:m="http://schemas.openxmlformats.org/officeDocument/2006/math" xmlns:v="urn:schemas-microsoft-com:vml" xmlns:wp14="http://schemas.microsoft.com/office/word/2010/wordprocessingDrawing" xmlns:wp="http://schemas.openxmlformats.org/drawingml/2006/wordprocessingDrawing" xmlns:w10="urn:schemas-microsoft-com:office:word" xmlns:w="http://schemas.openxmlformats.org/wordprocessingml/2006/main" xmlns:w14="http://schemas.microsoft.com/office/word/2010/wordml" xmlns:wpg="http://schemas.microsoft.com/office/word/2010/wordprocessingGroup" xmlns:wpi="http://schemas.microsoft.com/office/word/2010/wordprocessingInk" xmlns:wne="http://schemas.microsoft.com/office/word/2006/wordml" xmlns:wps="http://schemas.microsoft.com/office/word/2010/wordprocessingShape" mc:Ignorable="w14 wp14">
   <w:body>
+    <w:tbl>
+      <w:tblPr>
+        <w:tblW w:type="auto" w:w="0"/>
+        <w:tblLayout w:type="fixed"/>
+        <w:tblLook w:firstColumn="1" w:firstRow="1" w:lastColumn="0" w:lastRow="0" w:noHBand="0" w:noVBand="1" w:val="04A0"/>
+      </w:tblPr>
+      <w:tblGrid>
+        <w:gridCol w:w="3100"/>
+        <w:gridCol w:w="6886"/>
+      </w:tblGrid>
+      <w:tr>
+        <w:tc>
+          <w:tcPr>
+            <w:tcW w:type="dxa" w:w="3100"/>
+          </w:tcPr>
+          <w:p>
+            <w:pPr>
+              <w:spacing w:after="0"/>
+            </w:pPr>
+            <w:r>
+              <w:drawing>
+                <wp:inline xmlns:a="http://schemas.openxmlformats.org/drawingml/2006/main" xmlns:pic="http://schemas.openxmlformats.org/drawingml/2006/picture">
+                  <wp:extent cx="1803400" cy="683707"/>
+                  <wp:docPr id="1" name="Picture 1"/>
+                  <wp:cNvGraphicFramePr>
+                    <a:graphicFrameLocks noChangeAspect="1"/>
+                  </wp:cNvGraphicFramePr>
+                  <a:graphic>
+                    <a:graphicData uri="http://schemas.openxmlformats.org/drawingml/2006/picture">
+                      <pic:pic>
+                        <pic:nvPicPr>
+                          <pic:cNvPr id="0" name="itqan.png"/>
+                          <pic:cNvPicPr/>
+                        </pic:nvPicPr>
+                        <pic:blipFill>
+                          <a:blip r:embed="rId10"/>
+                          <a:stretch>
+                            <a:fillRect/>
+                          </a:stretch>
+                        </pic:blipFill>
+                        <pic:spPr>
+                          <a:xfrm>
+                            <a:off x="0" y="0"/>
+                            <a:ext cx="1803400" cy="683707"/>
+                          </a:xfrm>
+                          <a:prstGeom prst="rect"/>
+                        </pic:spPr>
+                      </pic:pic>
+                    </a:graphicData>
+                  </a:graphic>
+                </wp:inline>
+              </w:drawing>
+            </w:r>
+          </w:p>
+        </w:tc>
+        <w:tc>
+          <w:tcPr>
+            <w:tcW w:type="dxa" w:w="6886"/>
+          </w:tcPr>
+          <w:p>
+            <w:pPr>
+              <w:spacing w:before="0" w:after="0" w:line="420" w:lineRule="exact"/>
+              <w:jc w:val="start"/>
+              <w:pStyle w:val="Title"/>
+              <w:bidi/>
+            </w:pPr>
+            <w:r>
+              <w:rPr>
+                <w:rFonts w:ascii="Bahij TheSansArabic Plain" w:hAnsi="Bahij TheSansArabic Plain" w:cs="Bahij TheSansArabic Plain"/>
+                <w:b/>
+                <w:color w:val="401D58"/>
+                <w:sz w:val="30"/>
+                <w:rtl/>
+                <w:szCs w:val="30"/>
+                <w:bCs/>
+              </w:rPr>
+              <w:t>طلب الإشتراك في صندوق النعيم العقاري (للشركات)</w:t>
+            </w:r>
+          </w:p>
+          <w:p>
+            <w:pPr>
+              <w:spacing w:before="0" w:after="0" w:line="300" w:lineRule="exact"/>
+              <w:jc w:val="right"/>
+            </w:pPr>
+            <w:r>
+              <w:rPr>
+                <w:rFonts w:ascii="Arial" w:hAnsi="Arial" w:cs="Bahij TheSansArabic Plain"/>
+                <w:b/>
+                <w:color w:val="656575"/>
+                <w:sz w:val="20"/>
+              </w:rPr>
+              <w:t>Subscription Form • Company</w:t>
+            </w:r>
+          </w:p>
+        </w:tc>
+      </w:tr>
+    </w:tbl>
     <w:p>
       <w:pPr>
-        <w:spacing w:before="0" w:after="0" w:line="380" w:lineRule="exact"/>
-        <w:jc w:val="start"/>
-        <w:bidi/>
-      </w:pPr>
-      <w:r>
-        <w:rPr>
-          <w:rFonts w:ascii="Bahij TheSansArabic Plain" w:hAnsi="Bahij TheSansArabic Plain" w:cs="Bahij TheSansArabic Plain"/>
-          <w:b/>
-          <w:color w:val="482563"/>
-          <w:sz w:val="28"/>
-          <w:rtl/>
-          <w:szCs w:val="28"/>
-          <w:bCs/>
-        </w:rPr>
-        <w:t>إتقان كابيتال</w:t>
-      </w:r>
-    </w:p>
-    <w:p>
-      <w:pPr>
-        <w:spacing w:before="0" w:after="0" w:line="260" w:lineRule="exact"/>
-        <w:jc w:val="left"/>
-      </w:pPr>
-      <w:r>
-        <w:rPr>
-          <w:rFonts w:ascii="Arial" w:hAnsi="Arial" w:cs="Bahij TheSansArabic Plain"/>
-          <w:b/>
-          <w:color w:val="482563"/>
-          <w:sz w:val="18"/>
-        </w:rPr>
-        <w:t>ITQAN CAPITAL</w:t>
-      </w:r>
-    </w:p>
-    <w:p>
-      <w:pPr>
-        <w:spacing w:before="0" w:after="0" w:line="500" w:lineRule="exact"/>
-        <w:jc w:val="start"/>
-        <w:bidi/>
-      </w:pPr>
-      <w:r>
-        <w:rPr>
-          <w:rFonts w:ascii="Bahij TheSansArabic Plain" w:hAnsi="Bahij TheSansArabic Plain" w:cs="Bahij TheSansArabic Plain"/>
-          <w:b/>
-          <w:color w:val="242235"/>
-          <w:sz w:val="34"/>
-          <w:rtl/>
-          <w:szCs w:val="34"/>
-          <w:bCs/>
-        </w:rPr>
-        <w:t>طلب الإشتراك في صندوق النعيم العقاري (للشركات)</w:t>
-      </w:r>
-    </w:p>
-    <w:p>
-      <w:pPr>
-        <w:spacing w:before="0" w:after="0" w:line="340" w:lineRule="exact"/>
-        <w:jc w:val="left"/>
-      </w:pPr>
-      <w:r>
-        <w:rPr>
-          <w:rFonts w:ascii="Arial" w:hAnsi="Arial" w:cs="Bahij TheSansArabic Plain"/>
-          <w:b w:val="0"/>
-          <w:color w:val="656575"/>
-          <w:sz w:val="20"/>
-        </w:rPr>
-        <w:t>Al Naeem Real Estate Fund • Subscription Application • Company</w:t>
-      </w:r>
-    </w:p>
-    <w:p>
-      <w:pPr>
-        <w:spacing w:line="140" w:lineRule="exact" w:after="0"/>
+        <w:spacing w:line="160" w:lineRule="exact" w:after="0"/>
       </w:pPr>
       <w:r>
         <w:rPr>
@@ -84,107 +113,205 @@
         <w:t xml:space="preserve"> </w:t>
       </w:r>
     </w:p>
+    <w:tbl>
+      <w:tblPr>
+        <w:tblW w:type="auto" w:w="0"/>
+        <w:tblLayout w:type="fixed"/>
+        <w:tblLook w:firstColumn="1" w:firstRow="1" w:lastColumn="0" w:lastRow="0" w:noHBand="0" w:noVBand="1" w:val="04A0"/>
+      </w:tblPr>
+      <w:tblGrid>
+        <w:gridCol w:w="4993"/>
+        <w:gridCol w:w="4993"/>
+      </w:tblGrid>
+      <w:tr>
+        <w:tc>
+          <w:tcPr>
+            <w:tcW w:type="dxa" w:w="4993"/>
+          </w:tcPr>
+          <w:p>
+            <w:pPr>
+              <w:spacing w:before="0" w:after="0" w:line="230" w:lineRule="exact"/>
+              <w:jc w:val="left"/>
+            </w:pPr>
+            <w:r>
+              <w:rPr>
+                <w:rFonts w:ascii="Arial" w:hAnsi="Arial" w:cs="Bahij TheSansArabic Plain"/>
+                <w:b w:val="0"/>
+                <w:color w:val="242235"/>
+                <w:sz w:val="16"/>
+              </w:rPr>
+              <w:t>Messrs.: Itqan Capital Co.</w:t>
+            </w:r>
+          </w:p>
+        </w:tc>
+        <w:tc>
+          <w:tcPr>
+            <w:tcW w:type="dxa" w:w="4993"/>
+          </w:tcPr>
+          <w:p>
+            <w:pPr>
+              <w:spacing w:before="0" w:after="0" w:line="260" w:lineRule="exact"/>
+              <w:jc w:val="start"/>
+              <w:bidi/>
+            </w:pPr>
+            <w:r>
+              <w:rPr>
+                <w:rFonts w:ascii="Bahij TheSansArabic Plain" w:hAnsi="Bahij TheSansArabic Plain" w:cs="Bahij TheSansArabic Plain"/>
+                <w:b w:val="0"/>
+                <w:color w:val="242235"/>
+                <w:sz w:val="18"/>
+                <w:rtl/>
+                <w:szCs w:val="18"/>
+              </w:rPr>
+              <w:t>السادة / شركة إتقان كابيتال</w:t>
+            </w:r>
+          </w:p>
+        </w:tc>
+      </w:tr>
+    </w:tbl>
     <w:p>
       <w:pPr>
-        <w:spacing w:before="0" w:after="0" w:line="300" w:lineRule="exact"/>
-        <w:jc w:val="start"/>
-        <w:bidi/>
-      </w:pPr>
-      <w:r>
-        <w:rPr>
-          <w:rFonts w:ascii="Bahij TheSansArabic Plain" w:hAnsi="Bahij TheSansArabic Plain" w:cs="Bahij TheSansArabic Plain"/>
-          <w:b/>
-          <w:color w:val="242235"/>
-          <w:sz w:val="20"/>
-          <w:rtl/>
-          <w:szCs w:val="20"/>
-          <w:bCs/>
-        </w:rPr>
-        <w:t>السادة / شركة إتقان كابيتال</w:t>
-      </w:r>
-    </w:p>
-    <w:p>
-      <w:pPr>
-        <w:spacing w:before="0" w:after="0" w:line="240" w:lineRule="exact"/>
-        <w:jc w:val="left"/>
-      </w:pPr>
-      <w:r>
-        <w:rPr>
-          <w:rFonts w:ascii="Arial" w:hAnsi="Arial" w:cs="Bahij TheSansArabic Plain"/>
-          <w:b w:val="0"/>
-          <w:color w:val="656575"/>
-          <w:sz w:val="16"/>
-        </w:rPr>
-        <w:t>Messrs.: Itqan Capital Co.</w:t>
-      </w:r>
-    </w:p>
-    <w:p>
-      <w:pPr>
-        <w:spacing w:before="0" w:after="0" w:line="260" w:lineRule="exact"/>
-        <w:jc w:val="start"/>
-        <w:bidi/>
-      </w:pPr>
-      <w:r>
-        <w:rPr>
-          <w:rFonts w:ascii="Bahij TheSansArabic Plain" w:hAnsi="Bahij TheSansArabic Plain" w:cs="Bahij TheSansArabic Plain"/>
-          <w:b w:val="0"/>
-          <w:color w:val="242235"/>
-          <w:sz w:val="18"/>
-          <w:rtl/>
-          <w:szCs w:val="18"/>
-        </w:rPr>
-        <w:t>بعد الاطلاع على نشرة الشروط والأحكام للصندوق الاستثماري صندوق النعيم العقاري والإحاطة علماً بكل الشروط والأحكام المنظمة للاستثمار، نعلمكم برغبتنا في المشاركة، ونلتزم التزاماً كاملاً بشروط وأحكام الصندوق.</w:t>
-      </w:r>
-    </w:p>
-    <w:p>
-      <w:pPr>
-        <w:spacing w:before="0" w:after="0" w:line="210" w:lineRule="exact"/>
-        <w:jc w:val="left"/>
+        <w:spacing w:line="80" w:lineRule="exact" w:after="0"/>
       </w:pPr>
       <w:r>
         <w:rPr>
           <w:rFonts w:ascii="Arial" w:hAnsi="Arial" w:cs="Bahij TheSansArabic Plain"/>
           <w:b w:val="0"/>
           <w:color w:val="242235"/>
-          <w:sz w:val="16"/>
+          <w:sz w:val="2"/>
         </w:rPr>
-        <w:t>Having reviewed the terms &amp; conditions of the Al Naeem Real Estate investment fund thereof, I hereby request to participate in your fund and assure I will abide by the terms and conditions of the investment fund.</w:t>
+        <w:t xml:space="preserve"> </w:t>
       </w:r>
     </w:p>
+    <w:tbl>
+      <w:tblPr>
+        <w:tblW w:type="auto" w:w="0"/>
+        <w:tblLayout w:type="fixed"/>
+        <w:tblLook w:firstColumn="1" w:firstRow="1" w:lastColumn="0" w:lastRow="0" w:noHBand="0" w:noVBand="1" w:val="04A0"/>
+      </w:tblPr>
+      <w:tblGrid>
+        <w:gridCol w:w="4993"/>
+        <w:gridCol w:w="4993"/>
+      </w:tblGrid>
+      <w:tr>
+        <w:tc>
+          <w:tcPr>
+            <w:tcW w:type="dxa" w:w="4993"/>
+          </w:tcPr>
+          <w:p>
+            <w:pPr>
+              <w:spacing w:before="0" w:after="0" w:line="230" w:lineRule="exact"/>
+              <w:jc w:val="left"/>
+            </w:pPr>
+            <w:r>
+              <w:rPr>
+                <w:rFonts w:ascii="Arial" w:hAnsi="Arial" w:cs="Bahij TheSansArabic Plain"/>
+                <w:b w:val="0"/>
+                <w:color w:val="242235"/>
+                <w:sz w:val="16"/>
+              </w:rPr>
+              <w:t>Having reviewed the terms &amp; conditions of the Al Naeem Real Estate investment fund thereof, I hereby request to participate in your fund and assure I will abide by the terms and conditions of the investment fund.</w:t>
+            </w:r>
+          </w:p>
+        </w:tc>
+        <w:tc>
+          <w:tcPr>
+            <w:tcW w:type="dxa" w:w="4993"/>
+          </w:tcPr>
+          <w:p>
+            <w:pPr>
+              <w:spacing w:before="0" w:after="0" w:line="260" w:lineRule="exact"/>
+              <w:jc w:val="start"/>
+              <w:bidi/>
+            </w:pPr>
+            <w:r>
+              <w:rPr>
+                <w:rFonts w:ascii="Bahij TheSansArabic Plain" w:hAnsi="Bahij TheSansArabic Plain" w:cs="Bahij TheSansArabic Plain"/>
+                <w:b w:val="0"/>
+                <w:color w:val="242235"/>
+                <w:sz w:val="18"/>
+                <w:rtl/>
+                <w:szCs w:val="18"/>
+              </w:rPr>
+              <w:t>بعد الاطلاع على نشرة الشروط والأحكام للصندوق الاستثماري صندوق النعيم العقاري والإحاطة علماً بكل الشروط والأحكام المنظمة للاستثمار، نعلمكم برغبتنا في المشاركة، ونلتزم التزاماً كاملاً بشروط وأحكام الصندوق.</w:t>
+            </w:r>
+          </w:p>
+        </w:tc>
+      </w:tr>
+    </w:tbl>
     <w:p>
       <w:pPr>
-        <w:spacing w:before="120" w:after="0" w:line="360" w:lineRule="exact"/>
-        <w:jc w:val="start"/>
-        <w:bidi/>
-      </w:pPr>
-      <w:r>
-        <w:rPr>
-          <w:rFonts w:ascii="Bahij TheSansArabic Plain" w:hAnsi="Bahij TheSansArabic Plain" w:cs="Bahij TheSansArabic Plain"/>
-          <w:b/>
-          <w:color w:val="482563"/>
-          <w:sz w:val="24"/>
-          <w:rtl/>
-          <w:szCs w:val="24"/>
-          <w:bCs/>
-        </w:rPr>
-        <w:t>تفاصيل العميل</w:t>
-      </w:r>
-    </w:p>
-    <w:p>
-      <w:pPr>
-        <w:spacing w:before="0" w:after="0" w:line="260" w:lineRule="exact"/>
-        <w:jc w:val="left"/>
+        <w:spacing w:line="80" w:lineRule="exact" w:after="0"/>
       </w:pPr>
       <w:r>
         <w:rPr>
           <w:rFonts w:ascii="Arial" w:hAnsi="Arial" w:cs="Bahij TheSansArabic Plain"/>
-          <w:b/>
-          <w:color w:val="656575"/>
-          <w:sz w:val="17"/>
+          <w:b w:val="0"/>
+          <w:color w:val="242235"/>
+          <w:sz w:val="2"/>
         </w:rPr>
-        <w:t>Customer details</w:t>
+        <w:t xml:space="preserve"> </w:t>
       </w:r>
     </w:p>
+    <w:tbl>
+      <w:tblPr>
+        <w:tblW w:type="auto" w:w="0"/>
+        <w:tblLayout w:type="fixed"/>
+        <w:tblLook w:firstColumn="1" w:firstRow="1" w:lastColumn="0" w:lastRow="0" w:noHBand="0" w:noVBand="1" w:val="04A0"/>
+      </w:tblPr>
+      <w:tblGrid>
+        <w:gridCol w:w="4993"/>
+        <w:gridCol w:w="4993"/>
+      </w:tblGrid>
+      <w:tr>
+        <w:tc>
+          <w:tcPr>
+            <w:tcW w:type="dxa" w:w="4993"/>
+            <w:shd w:fill="401D58"/>
+          </w:tcPr>
+          <w:p>
+            <w:pPr>
+              <w:spacing w:before="0" w:after="0" w:line="380" w:lineRule="exact"/>
+              <w:jc w:val="left"/>
+            </w:pPr>
+            <w:r>
+              <w:rPr>
+                <w:rFonts w:ascii="Arial" w:hAnsi="Arial" w:cs="Bahij TheSansArabic Plain"/>
+                <w:b/>
+                <w:color w:val="FFFFFF"/>
+                <w:sz w:val="18"/>
+              </w:rPr>
+              <w:t>Client Details</w:t>
+            </w:r>
+          </w:p>
+        </w:tc>
+        <w:tc>
+          <w:tcPr>
+            <w:tcW w:type="dxa" w:w="4993"/>
+            <w:shd w:fill="401D58"/>
+          </w:tcPr>
+          <w:p>
+            <w:pPr>
+              <w:spacing w:before="0" w:after="0" w:line="380" w:lineRule="exact"/>
+              <w:jc w:val="start"/>
+              <w:bidi/>
+            </w:pPr>
+            <w:r>
+              <w:rPr>
+                <w:rFonts w:ascii="Bahij TheSansArabic Plain" w:hAnsi="Bahij TheSansArabic Plain" w:cs="Bahij TheSansArabic Plain"/>
+                <w:b/>
+                <w:color w:val="FFFFFF"/>
+                <w:sz w:val="21"/>
+                <w:rtl/>
+                <w:szCs w:val="21"/>
+                <w:bCs/>
+              </w:rPr>
+              <w:t>تفاصيل العميل</w:t>
+            </w:r>
+          </w:p>
+        </w:tc>
+      </w:tr>
+    </w:tbl>
     <w:p>
       <w:pPr>
         <w:spacing w:line="60" w:lineRule="exact" w:after="0"/>
@@ -206,12 +333,12 @@
         <w:tblLayout w:type="fixed"/>
         <w:tblLook w:firstColumn="1" w:firstRow="1" w:lastColumn="0" w:lastRow="0" w:noHBand="0" w:noVBand="1" w:val="04A0"/>
         <w:tblBorders>
-          <w:top w:val="single" w:sz="3" w:color="D8DCE5"/>
-          <w:bottom w:val="single" w:sz="3" w:color="D8DCE5"/>
-          <w:left w:val="single" w:sz="3" w:color="D8DCE5"/>
-          <w:right w:val="single" w:sz="3" w:color="D8DCE5"/>
-          <w:insideV w:val="single" w:sz="3" w:color="D8DCE5"/>
-          <w:insideH w:val="single" w:sz="3" w:color="D8DCE5"/>
+          <w:top w:val="single" w:sz="3" w:color="9B92A2"/>
+          <w:bottom w:val="single" w:sz="3" w:color="9B92A2"/>
+          <w:left w:val="single" w:sz="3" w:color="9B92A2"/>
+          <w:right w:val="single" w:sz="3" w:color="9B92A2"/>
+          <w:insideV w:val="single" w:sz="3" w:color="9B92A2"/>
+          <w:insideH w:val="single" w:sz="3" w:color="9B92A2"/>
         </w:tblBorders>
       </w:tblPr>
       <w:tblGrid>
@@ -219,7 +346,7 @@
       </w:tblGrid>
       <w:tr>
         <w:trPr>
-          <w:trHeight w:val="860" w:hRule="exact"/>
+          <w:trHeight w:val="800" w:hRule="exact"/>
           <w:cantSplit/>
         </w:trPr>
         <w:tc>
@@ -267,7 +394,7 @@
           </w:p>
           <w:p>
             <w:pPr>
-              <w:spacing w:line="300" w:lineRule="exact" w:after="0" w:before="0"/>
+              <w:spacing w:line="240" w:lineRule="exact" w:after="0" w:before="0"/>
             </w:pPr>
             <w:r>
               <w:rPr>
@@ -289,25 +416,84 @@
         <w:tblLayout w:type="fixed"/>
         <w:tblLook w:firstColumn="1" w:firstRow="1" w:lastColumn="0" w:lastRow="0" w:noHBand="0" w:noVBand="1" w:val="04A0"/>
         <w:tblBorders>
-          <w:top w:val="single" w:sz="3" w:color="D8DCE5"/>
-          <w:bottom w:val="single" w:sz="3" w:color="D8DCE5"/>
-          <w:left w:val="single" w:sz="3" w:color="D8DCE5"/>
-          <w:right w:val="single" w:sz="3" w:color="D8DCE5"/>
-          <w:insideV w:val="single" w:sz="3" w:color="D8DCE5"/>
-          <w:insideH w:val="single" w:sz="3" w:color="D8DCE5"/>
+          <w:top w:val="single" w:sz="3" w:color="9B92A2"/>
+          <w:bottom w:val="single" w:sz="3" w:color="9B92A2"/>
+          <w:left w:val="single" w:sz="3" w:color="9B92A2"/>
+          <w:right w:val="single" w:sz="3" w:color="9B92A2"/>
+          <w:insideV w:val="single" w:sz="3" w:color="9B92A2"/>
+          <w:insideH w:val="single" w:sz="3" w:color="9B92A2"/>
         </w:tblBorders>
       </w:tblPr>
       <w:tblGrid>
-        <w:gridCol w:w="9986"/>
+        <w:gridCol w:w="2100"/>
+        <w:gridCol w:w="7886"/>
       </w:tblGrid>
       <w:tr>
         <w:trPr>
-          <w:trHeight w:val="940" w:hRule="exact"/>
+          <w:trHeight w:val="920" w:hRule="exact"/>
           <w:cantSplit/>
         </w:trPr>
         <w:tc>
           <w:tcPr>
-            <w:tcW w:type="dxa" w:w="9986"/>
+            <w:tcW w:type="dxa" w:w="2100"/>
+            <w:tcMar>
+              <w:top w:w="35" w:type="dxa"/>
+              <w:bottom w:w="25" w:type="dxa"/>
+              <w:left w:w="100" w:type="dxa"/>
+              <w:right w:w="100" w:type="dxa"/>
+            </w:tcMar>
+          </w:tcPr>
+          <w:p>
+            <w:pPr>
+              <w:spacing w:before="0" w:after="0" w:line="260" w:lineRule="exact"/>
+              <w:jc w:val="start"/>
+              <w:bidi/>
+            </w:pPr>
+            <w:r>
+              <w:rPr>
+                <w:rFonts w:ascii="Bahij TheSansArabic Plain" w:hAnsi="Bahij TheSansArabic Plain" w:cs="Bahij TheSansArabic Plain"/>
+                <w:b w:val="0"/>
+                <w:color w:val="242235"/>
+                <w:sz w:val="19"/>
+                <w:rtl/>
+                <w:szCs w:val="19"/>
+              </w:rPr>
+              <w:t>الصفة</w:t>
+            </w:r>
+          </w:p>
+          <w:p>
+            <w:pPr>
+              <w:spacing w:before="0" w:after="0" w:line="220" w:lineRule="exact"/>
+              <w:jc w:val="left"/>
+            </w:pPr>
+            <w:r>
+              <w:rPr>
+                <w:rFonts w:ascii="Arial" w:hAnsi="Arial" w:cs="Bahij TheSansArabic Plain"/>
+                <w:b w:val="0"/>
+                <w:color w:val="656575"/>
+                <w:sz w:val="15"/>
+              </w:rPr>
+              <w:t>Title</w:t>
+            </w:r>
+          </w:p>
+          <w:p>
+            <w:pPr>
+              <w:spacing w:line="360" w:lineRule="exact" w:after="0" w:before="0"/>
+            </w:pPr>
+            <w:r>
+              <w:rPr>
+                <w:rFonts w:ascii="Arial" w:hAnsi="Arial" w:cs="Bahij TheSansArabic Plain"/>
+                <w:b w:val="0"/>
+                <w:color w:val="242235"/>
+                <w:sz w:val="8"/>
+              </w:rPr>
+              <w:t xml:space="preserve"> </w:t>
+            </w:r>
+          </w:p>
+        </w:tc>
+        <w:tc>
+          <w:tcPr>
+            <w:tcW w:type="dxa" w:w="7886"/>
             <w:tcMar>
               <w:top w:w="35" w:type="dxa"/>
               <w:bottom w:w="25" w:type="dxa"/>
@@ -350,7 +536,7 @@
           </w:p>
           <w:p>
             <w:pPr>
-              <w:spacing w:line="380" w:lineRule="exact" w:after="0" w:before="0"/>
+              <w:spacing w:line="360" w:lineRule="exact" w:after="0" w:before="0"/>
             </w:pPr>
             <w:r>
               <w:rPr>
@@ -372,12 +558,95 @@
         <w:tblLayout w:type="fixed"/>
         <w:tblLook w:firstColumn="1" w:firstRow="1" w:lastColumn="0" w:lastRow="0" w:noHBand="0" w:noVBand="1" w:val="04A0"/>
         <w:tblBorders>
-          <w:top w:val="single" w:sz="3" w:color="D8DCE5"/>
-          <w:bottom w:val="single" w:sz="3" w:color="D8DCE5"/>
-          <w:left w:val="single" w:sz="3" w:color="D8DCE5"/>
-          <w:right w:val="single" w:sz="3" w:color="D8DCE5"/>
-          <w:insideV w:val="single" w:sz="3" w:color="D8DCE5"/>
-          <w:insideH w:val="single" w:sz="3" w:color="D8DCE5"/>
+          <w:top w:val="single" w:sz="3" w:color="9B92A2"/>
+          <w:bottom w:val="single" w:sz="3" w:color="9B92A2"/>
+          <w:left w:val="single" w:sz="3" w:color="9B92A2"/>
+          <w:right w:val="single" w:sz="3" w:color="9B92A2"/>
+          <w:insideV w:val="single" w:sz="3" w:color="9B92A2"/>
+          <w:insideH w:val="single" w:sz="3" w:color="9B92A2"/>
+        </w:tblBorders>
+      </w:tblPr>
+      <w:tblGrid>
+        <w:gridCol w:w="9986"/>
+      </w:tblGrid>
+      <w:tr>
+        <w:trPr>
+          <w:trHeight w:val="920" w:hRule="exact"/>
+          <w:cantSplit/>
+        </w:trPr>
+        <w:tc>
+          <w:tcPr>
+            <w:tcW w:type="dxa" w:w="9986"/>
+            <w:tcMar>
+              <w:top w:w="35" w:type="dxa"/>
+              <w:bottom w:w="25" w:type="dxa"/>
+              <w:left w:w="100" w:type="dxa"/>
+              <w:right w:w="100" w:type="dxa"/>
+            </w:tcMar>
+          </w:tcPr>
+          <w:p>
+            <w:pPr>
+              <w:spacing w:before="0" w:after="0" w:line="260" w:lineRule="exact"/>
+              <w:jc w:val="start"/>
+              <w:bidi/>
+            </w:pPr>
+            <w:r>
+              <w:rPr>
+                <w:rFonts w:ascii="Bahij TheSansArabic Plain" w:hAnsi="Bahij TheSansArabic Plain" w:cs="Bahij TheSansArabic Plain"/>
+                <w:b w:val="0"/>
+                <w:color w:val="242235"/>
+                <w:sz w:val="19"/>
+                <w:rtl/>
+                <w:szCs w:val="19"/>
+              </w:rPr>
+              <w:t>اسم الشركة بالإنجليزية</w:t>
+            </w:r>
+          </w:p>
+          <w:p>
+            <w:pPr>
+              <w:spacing w:before="0" w:after="0" w:line="220" w:lineRule="exact"/>
+              <w:jc w:val="left"/>
+            </w:pPr>
+            <w:r>
+              <w:rPr>
+                <w:rFonts w:ascii="Arial" w:hAnsi="Arial" w:cs="Bahij TheSansArabic Plain"/>
+                <w:b w:val="0"/>
+                <w:color w:val="656575"/>
+                <w:sz w:val="15"/>
+              </w:rPr>
+              <w:t>Company name in English</w:t>
+            </w:r>
+          </w:p>
+          <w:p>
+            <w:pPr>
+              <w:spacing w:line="360" w:lineRule="exact" w:after="0" w:before="0"/>
+            </w:pPr>
+            <w:r>
+              <w:rPr>
+                <w:rFonts w:ascii="Arial" w:hAnsi="Arial" w:cs="Bahij TheSansArabic Plain"/>
+                <w:b w:val="0"/>
+                <w:color w:val="242235"/>
+                <w:sz w:val="8"/>
+              </w:rPr>
+              <w:t xml:space="preserve"> </w:t>
+            </w:r>
+          </w:p>
+        </w:tc>
+      </w:tr>
+    </w:tbl>
+    <w:tbl>
+      <w:tblPr>
+        <w:tblW w:type="auto" w:w="0"/>
+        <w:jc w:val="center"/>
+        <w:tblLayout w:type="fixed"/>
+        <w:tblLook w:firstColumn="1" w:firstRow="1" w:lastColumn="0" w:lastRow="0" w:noHBand="0" w:noVBand="1" w:val="04A0"/>
+        <w:tblBorders>
+          <w:top w:val="single" w:sz="3" w:color="9B92A2"/>
+          <w:bottom w:val="single" w:sz="3" w:color="9B92A2"/>
+          <w:left w:val="single" w:sz="3" w:color="9B92A2"/>
+          <w:right w:val="single" w:sz="3" w:color="9B92A2"/>
+          <w:insideV w:val="single" w:sz="3" w:color="9B92A2"/>
+          <w:insideH w:val="single" w:sz="3" w:color="9B92A2"/>
         </w:tblBorders>
       </w:tblPr>
       <w:tblGrid>
@@ -386,7 +655,7 @@
       </w:tblGrid>
       <w:tr>
         <w:trPr>
-          <w:trHeight w:val="940" w:hRule="exact"/>
+          <w:trHeight w:val="880" w:hRule="exact"/>
           <w:cantSplit/>
         </w:trPr>
         <w:tc>
@@ -434,7 +703,7 @@
           </w:p>
           <w:p>
             <w:pPr>
-              <w:spacing w:line="380" w:lineRule="exact" w:after="0" w:before="0"/>
+              <w:spacing w:line="320" w:lineRule="exact" w:after="0" w:before="0"/>
             </w:pPr>
             <w:r>
               <w:rPr>
@@ -492,7 +761,7 @@
           </w:p>
           <w:p>
             <w:pPr>
-              <w:spacing w:line="380" w:lineRule="exact" w:after="0" w:before="0"/>
+              <w:spacing w:line="320" w:lineRule="exact" w:after="0" w:before="0"/>
             </w:pPr>
             <w:r>
               <w:rPr>
@@ -514,12 +783,12 @@
         <w:tblLayout w:type="fixed"/>
         <w:tblLook w:firstColumn="1" w:firstRow="1" w:lastColumn="0" w:lastRow="0" w:noHBand="0" w:noVBand="1" w:val="04A0"/>
         <w:tblBorders>
-          <w:top w:val="single" w:sz="3" w:color="D8DCE5"/>
-          <w:bottom w:val="single" w:sz="3" w:color="D8DCE5"/>
-          <w:left w:val="single" w:sz="3" w:color="D8DCE5"/>
-          <w:right w:val="single" w:sz="3" w:color="D8DCE5"/>
-          <w:insideV w:val="single" w:sz="3" w:color="D8DCE5"/>
-          <w:insideH w:val="single" w:sz="3" w:color="D8DCE5"/>
+          <w:top w:val="single" w:sz="3" w:color="9B92A2"/>
+          <w:bottom w:val="single" w:sz="3" w:color="9B92A2"/>
+          <w:left w:val="single" w:sz="3" w:color="9B92A2"/>
+          <w:right w:val="single" w:sz="3" w:color="9B92A2"/>
+          <w:insideV w:val="single" w:sz="3" w:color="9B92A2"/>
+          <w:insideH w:val="single" w:sz="3" w:color="9B92A2"/>
         </w:tblBorders>
       </w:tblPr>
       <w:tblGrid>
@@ -528,7 +797,7 @@
       </w:tblGrid>
       <w:tr>
         <w:trPr>
-          <w:trHeight w:val="940" w:hRule="exact"/>
+          <w:trHeight w:val="880" w:hRule="exact"/>
           <w:cantSplit/>
         </w:trPr>
         <w:tc>
@@ -576,7 +845,7 @@
           </w:p>
           <w:p>
             <w:pPr>
-              <w:spacing w:line="380" w:lineRule="exact" w:after="0" w:before="0"/>
+              <w:spacing w:line="320" w:lineRule="exact" w:after="0" w:before="0"/>
             </w:pPr>
             <w:r>
               <w:rPr>
@@ -634,7 +903,7 @@
           </w:p>
           <w:p>
             <w:pPr>
-              <w:spacing w:line="380" w:lineRule="exact" w:after="0" w:before="0"/>
+              <w:spacing w:line="320" w:lineRule="exact" w:after="0" w:before="0"/>
             </w:pPr>
             <w:r>
               <w:rPr>
@@ -656,12 +925,12 @@
         <w:tblLayout w:type="fixed"/>
         <w:tblLook w:firstColumn="1" w:firstRow="1" w:lastColumn="0" w:lastRow="0" w:noHBand="0" w:noVBand="1" w:val="04A0"/>
         <w:tblBorders>
-          <w:top w:val="single" w:sz="3" w:color="D8DCE5"/>
-          <w:bottom w:val="single" w:sz="3" w:color="D8DCE5"/>
-          <w:left w:val="single" w:sz="3" w:color="D8DCE5"/>
-          <w:right w:val="single" w:sz="3" w:color="D8DCE5"/>
-          <w:insideV w:val="single" w:sz="3" w:color="D8DCE5"/>
-          <w:insideH w:val="single" w:sz="3" w:color="D8DCE5"/>
+          <w:top w:val="single" w:sz="3" w:color="9B92A2"/>
+          <w:bottom w:val="single" w:sz="3" w:color="9B92A2"/>
+          <w:left w:val="single" w:sz="3" w:color="9B92A2"/>
+          <w:right w:val="single" w:sz="3" w:color="9B92A2"/>
+          <w:insideV w:val="single" w:sz="3" w:color="9B92A2"/>
+          <w:insideH w:val="single" w:sz="3" w:color="9B92A2"/>
         </w:tblBorders>
       </w:tblPr>
       <w:tblGrid>
@@ -669,7 +938,7 @@
       </w:tblGrid>
       <w:tr>
         <w:trPr>
-          <w:trHeight w:val="940" w:hRule="exact"/>
+          <w:trHeight w:val="880" w:hRule="exact"/>
           <w:cantSplit/>
         </w:trPr>
         <w:tc>
@@ -717,7 +986,7 @@
           </w:p>
           <w:p>
             <w:pPr>
-              <w:spacing w:line="380" w:lineRule="exact" w:after="0" w:before="0"/>
+              <w:spacing w:line="320" w:lineRule="exact" w:after="0" w:before="0"/>
             </w:pPr>
             <w:r>
               <w:rPr>
@@ -739,12 +1008,12 @@
         <w:tblLayout w:type="fixed"/>
         <w:tblLook w:firstColumn="1" w:firstRow="1" w:lastColumn="0" w:lastRow="0" w:noHBand="0" w:noVBand="1" w:val="04A0"/>
         <w:tblBorders>
-          <w:top w:val="single" w:sz="3" w:color="D8DCE5"/>
-          <w:bottom w:val="single" w:sz="3" w:color="D8DCE5"/>
-          <w:left w:val="single" w:sz="3" w:color="D8DCE5"/>
-          <w:right w:val="single" w:sz="3" w:color="D8DCE5"/>
-          <w:insideV w:val="single" w:sz="3" w:color="D8DCE5"/>
-          <w:insideH w:val="single" w:sz="3" w:color="D8DCE5"/>
+          <w:top w:val="single" w:sz="3" w:color="9B92A2"/>
+          <w:bottom w:val="single" w:sz="3" w:color="9B92A2"/>
+          <w:left w:val="single" w:sz="3" w:color="9B92A2"/>
+          <w:right w:val="single" w:sz="3" w:color="9B92A2"/>
+          <w:insideV w:val="single" w:sz="3" w:color="9B92A2"/>
+          <w:insideH w:val="single" w:sz="3" w:color="9B92A2"/>
         </w:tblBorders>
       </w:tblPr>
       <w:tblGrid>
@@ -753,7 +1022,7 @@
       </w:tblGrid>
       <w:tr>
         <w:trPr>
-          <w:trHeight w:val="940" w:hRule="exact"/>
+          <w:trHeight w:val="880" w:hRule="exact"/>
           <w:cantSplit/>
         </w:trPr>
         <w:tc>
@@ -801,7 +1070,7 @@
           </w:p>
           <w:p>
             <w:pPr>
-              <w:spacing w:line="380" w:lineRule="exact" w:after="0" w:before="0"/>
+              <w:spacing w:line="320" w:lineRule="exact" w:after="0" w:before="0"/>
             </w:pPr>
             <w:r>
               <w:rPr>
@@ -859,7 +1128,7 @@
           </w:p>
           <w:p>
             <w:pPr>
-              <w:spacing w:line="380" w:lineRule="exact" w:after="0" w:before="0"/>
+              <w:spacing w:line="320" w:lineRule="exact" w:after="0" w:before="0"/>
             </w:pPr>
             <w:r>
               <w:rPr>
@@ -876,38 +1145,77 @@
     </w:tbl>
     <w:p>
       <w:pPr>
-        <w:spacing w:before="120" w:after="0" w:line="360" w:lineRule="exact"/>
-        <w:jc w:val="start"/>
-        <w:bidi/>
-      </w:pPr>
-      <w:r>
-        <w:rPr>
-          <w:rFonts w:ascii="Bahij TheSansArabic Plain" w:hAnsi="Bahij TheSansArabic Plain" w:cs="Bahij TheSansArabic Plain"/>
-          <w:b/>
-          <w:color w:val="482563"/>
-          <w:sz w:val="24"/>
-          <w:rtl/>
-          <w:szCs w:val="24"/>
-          <w:bCs/>
-        </w:rPr>
-        <w:t>عنوان المراسلة (العنوان الوطني)</w:t>
-      </w:r>
-    </w:p>
-    <w:p>
-      <w:pPr>
-        <w:spacing w:before="0" w:after="0" w:line="260" w:lineRule="exact"/>
-        <w:jc w:val="left"/>
+        <w:spacing w:line="120" w:lineRule="exact" w:after="0"/>
       </w:pPr>
       <w:r>
         <w:rPr>
           <w:rFonts w:ascii="Arial" w:hAnsi="Arial" w:cs="Bahij TheSansArabic Plain"/>
-          <w:b/>
-          <w:color w:val="656575"/>
-          <w:sz w:val="17"/>
+          <w:b w:val="0"/>
+          <w:color w:val="242235"/>
+          <w:sz w:val="2"/>
         </w:rPr>
-        <w:t>Correspondence address (National Address)</w:t>
+        <w:t xml:space="preserve"> </w:t>
       </w:r>
     </w:p>
+    <w:tbl>
+      <w:tblPr>
+        <w:tblW w:type="auto" w:w="0"/>
+        <w:tblLayout w:type="fixed"/>
+        <w:tblLook w:firstColumn="1" w:firstRow="1" w:lastColumn="0" w:lastRow="0" w:noHBand="0" w:noVBand="1" w:val="04A0"/>
+      </w:tblPr>
+      <w:tblGrid>
+        <w:gridCol w:w="4993"/>
+        <w:gridCol w:w="4993"/>
+      </w:tblGrid>
+      <w:tr>
+        <w:tc>
+          <w:tcPr>
+            <w:tcW w:type="dxa" w:w="4993"/>
+            <w:shd w:fill="401D58"/>
+          </w:tcPr>
+          <w:p>
+            <w:pPr>
+              <w:spacing w:before="0" w:after="0" w:line="380" w:lineRule="exact"/>
+              <w:jc w:val="left"/>
+            </w:pPr>
+            <w:r>
+              <w:rPr>
+                <w:rFonts w:ascii="Arial" w:hAnsi="Arial" w:cs="Bahij TheSansArabic Plain"/>
+                <w:b/>
+                <w:color w:val="FFFFFF"/>
+                <w:sz w:val="18"/>
+              </w:rPr>
+              <w:t>Correspondence Address (National Address)</w:t>
+            </w:r>
+          </w:p>
+        </w:tc>
+        <w:tc>
+          <w:tcPr>
+            <w:tcW w:type="dxa" w:w="4993"/>
+            <w:shd w:fill="401D58"/>
+          </w:tcPr>
+          <w:p>
+            <w:pPr>
+              <w:spacing w:before="0" w:after="0" w:line="380" w:lineRule="exact"/>
+              <w:jc w:val="start"/>
+              <w:bidi/>
+            </w:pPr>
+            <w:r>
+              <w:rPr>
+                <w:rFonts w:ascii="Bahij TheSansArabic Plain" w:hAnsi="Bahij TheSansArabic Plain" w:cs="Bahij TheSansArabic Plain"/>
+                <w:b/>
+                <w:color w:val="FFFFFF"/>
+                <w:sz w:val="21"/>
+                <w:rtl/>
+                <w:szCs w:val="21"/>
+                <w:bCs/>
+              </w:rPr>
+              <w:t>عنوان المراسلة (العنوان الوطني)</w:t>
+            </w:r>
+          </w:p>
+        </w:tc>
+      </w:tr>
+    </w:tbl>
     <w:p>
       <w:pPr>
         <w:spacing w:line="60" w:lineRule="exact" w:after="0"/>
@@ -929,12 +1237,12 @@
         <w:tblLayout w:type="fixed"/>
         <w:tblLook w:firstColumn="1" w:firstRow="1" w:lastColumn="0" w:lastRow="0" w:noHBand="0" w:noVBand="1" w:val="04A0"/>
         <w:tblBorders>
-          <w:top w:val="single" w:sz="3" w:color="D8DCE5"/>
-          <w:bottom w:val="single" w:sz="3" w:color="D8DCE5"/>
-          <w:left w:val="single" w:sz="3" w:color="D8DCE5"/>
-          <w:right w:val="single" w:sz="3" w:color="D8DCE5"/>
-          <w:insideV w:val="single" w:sz="3" w:color="D8DCE5"/>
-          <w:insideH w:val="single" w:sz="3" w:color="D8DCE5"/>
+          <w:top w:val="single" w:sz="3" w:color="9B92A2"/>
+          <w:bottom w:val="single" w:sz="3" w:color="9B92A2"/>
+          <w:left w:val="single" w:sz="3" w:color="9B92A2"/>
+          <w:right w:val="single" w:sz="3" w:color="9B92A2"/>
+          <w:insideV w:val="single" w:sz="3" w:color="9B92A2"/>
+          <w:insideH w:val="single" w:sz="3" w:color="9B92A2"/>
         </w:tblBorders>
       </w:tblPr>
       <w:tblGrid>
@@ -944,7 +1252,7 @@
       </w:tblGrid>
       <w:tr>
         <w:trPr>
-          <w:trHeight w:val="940" w:hRule="exact"/>
+          <w:trHeight w:val="880" w:hRule="exact"/>
           <w:cantSplit/>
         </w:trPr>
         <w:tc>
@@ -992,7 +1300,7 @@
           </w:p>
           <w:p>
             <w:pPr>
-              <w:spacing w:line="380" w:lineRule="exact" w:after="0" w:before="0"/>
+              <w:spacing w:line="320" w:lineRule="exact" w:after="0" w:before="0"/>
             </w:pPr>
             <w:r>
               <w:rPr>
@@ -1050,7 +1358,7 @@
           </w:p>
           <w:p>
             <w:pPr>
-              <w:spacing w:line="380" w:lineRule="exact" w:after="0" w:before="0"/>
+              <w:spacing w:line="320" w:lineRule="exact" w:after="0" w:before="0"/>
             </w:pPr>
             <w:r>
               <w:rPr>
@@ -1108,7 +1416,7 @@
           </w:p>
           <w:p>
             <w:pPr>
-              <w:spacing w:line="380" w:lineRule="exact" w:after="0" w:before="0"/>
+              <w:spacing w:line="320" w:lineRule="exact" w:after="0" w:before="0"/>
             </w:pPr>
             <w:r>
               <w:rPr>
@@ -1130,12 +1438,12 @@
         <w:tblLayout w:type="fixed"/>
         <w:tblLook w:firstColumn="1" w:firstRow="1" w:lastColumn="0" w:lastRow="0" w:noHBand="0" w:noVBand="1" w:val="04A0"/>
         <w:tblBorders>
-          <w:top w:val="single" w:sz="3" w:color="D8DCE5"/>
-          <w:bottom w:val="single" w:sz="3" w:color="D8DCE5"/>
-          <w:left w:val="single" w:sz="3" w:color="D8DCE5"/>
-          <w:right w:val="single" w:sz="3" w:color="D8DCE5"/>
-          <w:insideV w:val="single" w:sz="3" w:color="D8DCE5"/>
-          <w:insideH w:val="single" w:sz="3" w:color="D8DCE5"/>
+          <w:top w:val="single" w:sz="3" w:color="9B92A2"/>
+          <w:bottom w:val="single" w:sz="3" w:color="9B92A2"/>
+          <w:left w:val="single" w:sz="3" w:color="9B92A2"/>
+          <w:right w:val="single" w:sz="3" w:color="9B92A2"/>
+          <w:insideV w:val="single" w:sz="3" w:color="9B92A2"/>
+          <w:insideH w:val="single" w:sz="3" w:color="9B92A2"/>
         </w:tblBorders>
       </w:tblPr>
       <w:tblGrid>
@@ -1144,7 +1452,7 @@
       </w:tblGrid>
       <w:tr>
         <w:trPr>
-          <w:trHeight w:val="940" w:hRule="exact"/>
+          <w:trHeight w:val="880" w:hRule="exact"/>
           <w:cantSplit/>
         </w:trPr>
         <w:tc>
@@ -1192,7 +1500,7 @@
           </w:p>
           <w:p>
             <w:pPr>
-              <w:spacing w:line="380" w:lineRule="exact" w:after="0" w:before="0"/>
+              <w:spacing w:line="320" w:lineRule="exact" w:after="0" w:before="0"/>
             </w:pPr>
             <w:r>
               <w:rPr>
@@ -1250,7 +1558,7 @@
           </w:p>
           <w:p>
             <w:pPr>
-              <w:spacing w:line="380" w:lineRule="exact" w:after="0" w:before="0"/>
+              <w:spacing w:line="320" w:lineRule="exact" w:after="0" w:before="0"/>
             </w:pPr>
             <w:r>
               <w:rPr>
@@ -1272,12 +1580,12 @@
         <w:tblLayout w:type="fixed"/>
         <w:tblLook w:firstColumn="1" w:firstRow="1" w:lastColumn="0" w:lastRow="0" w:noHBand="0" w:noVBand="1" w:val="04A0"/>
         <w:tblBorders>
-          <w:top w:val="single" w:sz="3" w:color="D8DCE5"/>
-          <w:bottom w:val="single" w:sz="3" w:color="D8DCE5"/>
-          <w:left w:val="single" w:sz="3" w:color="D8DCE5"/>
-          <w:right w:val="single" w:sz="3" w:color="D8DCE5"/>
-          <w:insideV w:val="single" w:sz="3" w:color="D8DCE5"/>
-          <w:insideH w:val="single" w:sz="3" w:color="D8DCE5"/>
+          <w:top w:val="single" w:sz="3" w:color="9B92A2"/>
+          <w:bottom w:val="single" w:sz="3" w:color="9B92A2"/>
+          <w:left w:val="single" w:sz="3" w:color="9B92A2"/>
+          <w:right w:val="single" w:sz="3" w:color="9B92A2"/>
+          <w:insideV w:val="single" w:sz="3" w:color="9B92A2"/>
+          <w:insideH w:val="single" w:sz="3" w:color="9B92A2"/>
         </w:tblBorders>
       </w:tblPr>
       <w:tblGrid>
@@ -1287,7 +1595,7 @@
       </w:tblGrid>
       <w:tr>
         <w:trPr>
-          <w:trHeight w:val="940" w:hRule="exact"/>
+          <w:trHeight w:val="880" w:hRule="exact"/>
           <w:cantSplit/>
         </w:trPr>
         <w:tc>
@@ -1335,7 +1643,7 @@
           </w:p>
           <w:p>
             <w:pPr>
-              <w:spacing w:line="380" w:lineRule="exact" w:after="0" w:before="0"/>
+              <w:spacing w:line="320" w:lineRule="exact" w:after="0" w:before="0"/>
             </w:pPr>
             <w:r>
               <w:rPr>
@@ -1393,7 +1701,7 @@
           </w:p>
           <w:p>
             <w:pPr>
-              <w:spacing w:line="380" w:lineRule="exact" w:after="0" w:before="0"/>
+              <w:spacing w:line="320" w:lineRule="exact" w:after="0" w:before="0"/>
             </w:pPr>
             <w:r>
               <w:rPr>
@@ -1451,7 +1759,7 @@
           </w:p>
           <w:p>
             <w:pPr>
-              <w:spacing w:line="380" w:lineRule="exact" w:after="0" w:before="0"/>
+              <w:spacing w:line="320" w:lineRule="exact" w:after="0" w:before="0"/>
             </w:pPr>
             <w:r>
               <w:rPr>
@@ -1473,25 +1781,26 @@
         <w:tblLayout w:type="fixed"/>
         <w:tblLook w:firstColumn="1" w:firstRow="1" w:lastColumn="0" w:lastRow="0" w:noHBand="0" w:noVBand="1" w:val="04A0"/>
         <w:tblBorders>
-          <w:top w:val="single" w:sz="3" w:color="D8DCE5"/>
-          <w:bottom w:val="single" w:sz="3" w:color="D8DCE5"/>
-          <w:left w:val="single" w:sz="3" w:color="D8DCE5"/>
-          <w:right w:val="single" w:sz="3" w:color="D8DCE5"/>
-          <w:insideV w:val="single" w:sz="3" w:color="D8DCE5"/>
-          <w:insideH w:val="single" w:sz="3" w:color="D8DCE5"/>
+          <w:top w:val="single" w:sz="3" w:color="9B92A2"/>
+          <w:bottom w:val="single" w:sz="3" w:color="9B92A2"/>
+          <w:left w:val="single" w:sz="3" w:color="9B92A2"/>
+          <w:right w:val="single" w:sz="3" w:color="9B92A2"/>
+          <w:insideV w:val="single" w:sz="3" w:color="9B92A2"/>
+          <w:insideH w:val="single" w:sz="3" w:color="9B92A2"/>
         </w:tblBorders>
       </w:tblPr>
       <w:tblGrid>
-        <w:gridCol w:w="9986"/>
+        <w:gridCol w:w="6491"/>
+        <w:gridCol w:w="3495"/>
       </w:tblGrid>
       <w:tr>
         <w:trPr>
-          <w:trHeight w:val="940" w:hRule="exact"/>
+          <w:trHeight w:val="880" w:hRule="exact"/>
           <w:cantSplit/>
         </w:trPr>
         <w:tc>
           <w:tcPr>
-            <w:tcW w:type="dxa" w:w="9986"/>
+            <w:tcW w:type="dxa" w:w="6491"/>
             <w:tcMar>
               <w:top w:w="35" w:type="dxa"/>
               <w:bottom w:w="25" w:type="dxa"/>
@@ -1534,7 +1843,65 @@
           </w:p>
           <w:p>
             <w:pPr>
-              <w:spacing w:line="380" w:lineRule="exact" w:after="0" w:before="0"/>
+              <w:spacing w:line="320" w:lineRule="exact" w:after="0" w:before="0"/>
+            </w:pPr>
+            <w:r>
+              <w:rPr>
+                <w:rFonts w:ascii="Arial" w:hAnsi="Arial" w:cs="Bahij TheSansArabic Plain"/>
+                <w:b w:val="0"/>
+                <w:color w:val="242235"/>
+                <w:sz w:val="8"/>
+              </w:rPr>
+              <w:t xml:space="preserve"> </w:t>
+            </w:r>
+          </w:p>
+        </w:tc>
+        <w:tc>
+          <w:tcPr>
+            <w:tcW w:type="dxa" w:w="3495"/>
+            <w:tcMar>
+              <w:top w:w="35" w:type="dxa"/>
+              <w:bottom w:w="25" w:type="dxa"/>
+              <w:left w:w="100" w:type="dxa"/>
+              <w:right w:w="100" w:type="dxa"/>
+            </w:tcMar>
+          </w:tcPr>
+          <w:p>
+            <w:pPr>
+              <w:spacing w:before="0" w:after="0" w:line="260" w:lineRule="exact"/>
+              <w:jc w:val="start"/>
+              <w:bidi/>
+            </w:pPr>
+            <w:r>
+              <w:rPr>
+                <w:rFonts w:ascii="Bahij TheSansArabic Plain" w:hAnsi="Bahij TheSansArabic Plain" w:cs="Bahij TheSansArabic Plain"/>
+                <w:b w:val="0"/>
+                <w:color w:val="242235"/>
+                <w:sz w:val="19"/>
+                <w:rtl/>
+                <w:szCs w:val="19"/>
+              </w:rPr>
+              <w:t>صندوق البريد (إن وجد)</w:t>
+            </w:r>
+          </w:p>
+          <w:p>
+            <w:pPr>
+              <w:spacing w:before="0" w:after="0" w:line="220" w:lineRule="exact"/>
+              <w:jc w:val="left"/>
+            </w:pPr>
+            <w:r>
+              <w:rPr>
+                <w:rFonts w:ascii="Arial" w:hAnsi="Arial" w:cs="Bahij TheSansArabic Plain"/>
+                <w:b w:val="0"/>
+                <w:color w:val="656575"/>
+                <w:sz w:val="15"/>
+              </w:rPr>
+              <w:t>P.O. Box (if applicable)</w:t>
+            </w:r>
+          </w:p>
+          <w:p>
+            <w:pPr>
+              <w:spacing w:line="320" w:lineRule="exact" w:after="0" w:before="0"/>
             </w:pPr>
             <w:r>
               <w:rPr>
@@ -1554,77 +1921,124 @@
         <w:br w:type="page"/>
       </w:r>
     </w:p>
+    <w:tbl>
+      <w:tblPr>
+        <w:tblW w:type="auto" w:w="0"/>
+        <w:tblLayout w:type="fixed"/>
+        <w:tblLook w:firstColumn="1" w:firstRow="1" w:lastColumn="0" w:lastRow="0" w:noHBand="0" w:noVBand="1" w:val="04A0"/>
+      </w:tblPr>
+      <w:tblGrid>
+        <w:gridCol w:w="3100"/>
+        <w:gridCol w:w="6886"/>
+      </w:tblGrid>
+      <w:tr>
+        <w:tc>
+          <w:tcPr>
+            <w:tcW w:type="dxa" w:w="3100"/>
+          </w:tcPr>
+          <w:p>
+            <w:pPr>
+              <w:spacing w:after="0"/>
+            </w:pPr>
+            <w:r>
+              <w:drawing>
+                <wp:inline xmlns:a="http://schemas.openxmlformats.org/drawingml/2006/main" xmlns:pic="http://schemas.openxmlformats.org/drawingml/2006/picture">
+                  <wp:extent cx="1803400" cy="683707"/>
+                  <wp:docPr id="2" name="Picture 2"/>
+                  <wp:cNvGraphicFramePr>
+                    <a:graphicFrameLocks noChangeAspect="1"/>
+                  </wp:cNvGraphicFramePr>
+                  <a:graphic>
+                    <a:graphicData uri="http://schemas.openxmlformats.org/drawingml/2006/picture">
+                      <pic:pic>
+                        <pic:nvPicPr>
+                          <pic:cNvPr id="0" name="itqan.png"/>
+                          <pic:cNvPicPr/>
+                        </pic:nvPicPr>
+                        <pic:blipFill>
+                          <a:blip r:embed="rId10"/>
+                          <a:stretch>
+                            <a:fillRect/>
+                          </a:stretch>
+                        </pic:blipFill>
+                        <pic:spPr>
+                          <a:xfrm>
+                            <a:off x="0" y="0"/>
+                            <a:ext cx="1803400" cy="683707"/>
+                          </a:xfrm>
+                          <a:prstGeom prst="rect"/>
+                        </pic:spPr>
+                      </pic:pic>
+                    </a:graphicData>
+                  </a:graphic>
+                </wp:inline>
+              </w:drawing>
+            </w:r>
+          </w:p>
+        </w:tc>
+        <w:tc>
+          <w:tcPr>
+            <w:tcW w:type="dxa" w:w="6886"/>
+          </w:tcPr>
+          <w:p>
+            <w:pPr>
+              <w:spacing w:before="0" w:after="0" w:line="420" w:lineRule="exact"/>
+              <w:jc w:val="start"/>
+              <w:pStyle w:val="Title"/>
+              <w:bidi/>
+            </w:pPr>
+            <w:r>
+              <w:rPr>
+                <w:rFonts w:ascii="Bahij TheSansArabic Plain" w:hAnsi="Bahij TheSansArabic Plain" w:cs="Bahij TheSansArabic Plain"/>
+                <w:b/>
+                <w:color w:val="401D58"/>
+                <w:sz w:val="28"/>
+                <w:rtl/>
+                <w:szCs w:val="28"/>
+                <w:bCs/>
+              </w:rPr>
+              <w:t>طلب اشتراك (للشركات)</w:t>
+            </w:r>
+          </w:p>
+          <w:p>
+            <w:pPr>
+              <w:spacing w:before="0" w:after="0" w:line="300" w:lineRule="exact"/>
+              <w:jc w:val="right"/>
+            </w:pPr>
+            <w:r>
+              <w:rPr>
+                <w:rFonts w:ascii="Arial" w:hAnsi="Arial" w:cs="Bahij TheSansArabic Plain"/>
+                <w:b/>
+                <w:color w:val="656575"/>
+                <w:sz w:val="20"/>
+              </w:rPr>
+              <w:t>Subscription Form • Company</w:t>
+            </w:r>
+          </w:p>
+          <w:p>
+            <w:pPr>
+              <w:spacing w:before="0" w:after="0" w:line="280" w:lineRule="exact"/>
+              <w:jc w:val="start"/>
+              <w:bidi/>
+            </w:pPr>
+            <w:r>
+              <w:rPr>
+                <w:rFonts w:ascii="Bahij TheSansArabic Plain" w:hAnsi="Bahij TheSansArabic Plain" w:cs="Bahij TheSansArabic Plain"/>
+                <w:b w:val="0"/>
+                <w:color w:val="656575"/>
+                <w:sz w:val="20"/>
+                <w:rtl/>
+                <w:szCs w:val="20"/>
+              </w:rPr>
+              <w:t>صندوق النعيم العقاري</w:t>
+            </w:r>
+          </w:p>
+        </w:tc>
+      </w:tr>
+    </w:tbl>
     <w:p>
       <w:pPr>
-        <w:spacing w:before="0" w:after="0" w:line="380" w:lineRule="exact"/>
-        <w:jc w:val="start"/>
-        <w:bidi/>
-      </w:pPr>
-      <w:r>
-        <w:rPr>
-          <w:rFonts w:ascii="Bahij TheSansArabic Plain" w:hAnsi="Bahij TheSansArabic Plain" w:cs="Bahij TheSansArabic Plain"/>
-          <w:b/>
-          <w:color w:val="482563"/>
-          <w:sz w:val="28"/>
-          <w:rtl/>
-          <w:szCs w:val="28"/>
-          <w:bCs/>
-        </w:rPr>
-        <w:t>إتقان كابيتال</w:t>
-      </w:r>
-    </w:p>
-    <w:p>
-      <w:pPr>
-        <w:spacing w:before="0" w:after="0" w:line="260" w:lineRule="exact"/>
-        <w:jc w:val="left"/>
-      </w:pPr>
-      <w:r>
-        <w:rPr>
-          <w:rFonts w:ascii="Arial" w:hAnsi="Arial" w:cs="Bahij TheSansArabic Plain"/>
-          <w:b/>
-          <w:color w:val="482563"/>
-          <w:sz w:val="18"/>
-        </w:rPr>
-        <w:t>ITQAN CAPITAL</w:t>
-      </w:r>
-    </w:p>
-    <w:p>
-      <w:pPr>
-        <w:spacing w:before="0" w:after="0" w:line="440" w:lineRule="exact"/>
-        <w:jc w:val="start"/>
-        <w:bidi/>
-      </w:pPr>
-      <w:r>
-        <w:rPr>
-          <w:rFonts w:ascii="Bahij TheSansArabic Plain" w:hAnsi="Bahij TheSansArabic Plain" w:cs="Bahij TheSansArabic Plain"/>
-          <w:b/>
-          <w:color w:val="242235"/>
-          <w:sz w:val="28"/>
-          <w:rtl/>
-          <w:szCs w:val="28"/>
-          <w:bCs/>
-        </w:rPr>
-        <w:t>صندوق النعيم العقاري | طلب اشتراك للشركات</w:t>
-      </w:r>
-    </w:p>
-    <w:p>
-      <w:pPr>
-        <w:spacing w:before="0" w:after="0" w:line="280" w:lineRule="exact"/>
-        <w:jc w:val="left"/>
-      </w:pPr>
-      <w:r>
-        <w:rPr>
-          <w:rFonts w:ascii="Arial" w:hAnsi="Arial" w:cs="Bahij TheSansArabic Plain"/>
-          <w:b w:val="0"/>
-          <w:color w:val="656575"/>
-          <w:sz w:val="18"/>
-        </w:rPr>
-        <w:t>Al Naeem Real Estate Fund • Company Subscription</w:t>
-      </w:r>
-    </w:p>
-    <w:p>
-      <w:pPr>
-        <w:spacing w:line="140" w:lineRule="exact" w:after="0"/>
+        <w:spacing w:line="160" w:lineRule="exact" w:after="0"/>
       </w:pPr>
       <w:r>
         <w:rPr>
@@ -1636,40 +2050,65 @@
         <w:t xml:space="preserve"> </w:t>
       </w:r>
     </w:p>
-    <w:p>
-      <w:pPr>
-        <w:spacing w:before="120" w:after="0" w:line="360" w:lineRule="exact"/>
-        <w:jc w:val="start"/>
-        <w:bidi/>
-      </w:pPr>
-      <w:r>
-        <w:rPr>
-          <w:rFonts w:ascii="Bahij TheSansArabic Plain" w:hAnsi="Bahij TheSansArabic Plain" w:cs="Bahij TheSansArabic Plain"/>
-          <w:b/>
-          <w:color w:val="482563"/>
-          <w:sz w:val="24"/>
-          <w:rtl/>
-          <w:szCs w:val="24"/>
-          <w:bCs/>
-        </w:rPr>
-        <w:t>تفاصيل الاشتراك</w:t>
-      </w:r>
-    </w:p>
-    <w:p>
-      <w:pPr>
-        <w:spacing w:before="0" w:after="0" w:line="260" w:lineRule="exact"/>
-        <w:jc w:val="left"/>
-      </w:pPr>
-      <w:r>
-        <w:rPr>
-          <w:rFonts w:ascii="Arial" w:hAnsi="Arial" w:cs="Bahij TheSansArabic Plain"/>
-          <w:b/>
-          <w:color w:val="656575"/>
-          <w:sz w:val="17"/>
-        </w:rPr>
-        <w:t>Subscription details</w:t>
-      </w:r>
-    </w:p>
+    <w:tbl>
+      <w:tblPr>
+        <w:tblW w:type="auto" w:w="0"/>
+        <w:tblLayout w:type="fixed"/>
+        <w:tblLook w:firstColumn="1" w:firstRow="1" w:lastColumn="0" w:lastRow="0" w:noHBand="0" w:noVBand="1" w:val="04A0"/>
+      </w:tblPr>
+      <w:tblGrid>
+        <w:gridCol w:w="4993"/>
+        <w:gridCol w:w="4993"/>
+      </w:tblGrid>
+      <w:tr>
+        <w:tc>
+          <w:tcPr>
+            <w:tcW w:type="dxa" w:w="4993"/>
+            <w:shd w:fill="401D58"/>
+          </w:tcPr>
+          <w:p>
+            <w:pPr>
+              <w:spacing w:before="0" w:after="0" w:line="380" w:lineRule="exact"/>
+              <w:jc w:val="left"/>
+            </w:pPr>
+            <w:r>
+              <w:rPr>
+                <w:rFonts w:ascii="Arial" w:hAnsi="Arial" w:cs="Bahij TheSansArabic Plain"/>
+                <w:b/>
+                <w:color w:val="FFFFFF"/>
+                <w:sz w:val="18"/>
+              </w:rPr>
+              <w:t>Subscription Details</w:t>
+            </w:r>
+          </w:p>
+        </w:tc>
+        <w:tc>
+          <w:tcPr>
+            <w:tcW w:type="dxa" w:w="4993"/>
+            <w:shd w:fill="401D58"/>
+          </w:tcPr>
+          <w:p>
+            <w:pPr>
+              <w:spacing w:before="0" w:after="0" w:line="380" w:lineRule="exact"/>
+              <w:jc w:val="start"/>
+              <w:bidi/>
+            </w:pPr>
+            <w:r>
+              <w:rPr>
+                <w:rFonts w:ascii="Bahij TheSansArabic Plain" w:hAnsi="Bahij TheSansArabic Plain" w:cs="Bahij TheSansArabic Plain"/>
+                <w:b/>
+                <w:color w:val="FFFFFF"/>
+                <w:sz w:val="21"/>
+                <w:rtl/>
+                <w:szCs w:val="21"/>
+                <w:bCs/>
+              </w:rPr>
+              <w:t>تفاصيل الاشتراك</w:t>
+            </w:r>
+          </w:p>
+        </w:tc>
+      </w:tr>
+    </w:tbl>
     <w:p>
       <w:pPr>
         <w:spacing w:line="60" w:lineRule="exact" w:after="0"/>
@@ -1691,12 +2130,12 @@
         <w:tblLayout w:type="fixed"/>
         <w:tblLook w:firstColumn="1" w:firstRow="1" w:lastColumn="0" w:lastRow="0" w:noHBand="0" w:noVBand="1" w:val="04A0"/>
         <w:tblBorders>
-          <w:top w:val="single" w:sz="3" w:color="D8DCE5"/>
-          <w:bottom w:val="single" w:sz="3" w:color="D8DCE5"/>
-          <w:left w:val="single" w:sz="3" w:color="D8DCE5"/>
-          <w:right w:val="single" w:sz="3" w:color="D8DCE5"/>
-          <w:insideV w:val="single" w:sz="3" w:color="D8DCE5"/>
-          <w:insideH w:val="single" w:sz="3" w:color="D8DCE5"/>
+          <w:top w:val="single" w:sz="3" w:color="9B92A2"/>
+          <w:bottom w:val="single" w:sz="3" w:color="9B92A2"/>
+          <w:left w:val="single" w:sz="3" w:color="9B92A2"/>
+          <w:right w:val="single" w:sz="3" w:color="9B92A2"/>
+          <w:insideV w:val="single" w:sz="3" w:color="9B92A2"/>
+          <w:insideH w:val="single" w:sz="3" w:color="9B92A2"/>
         </w:tblBorders>
       </w:tblPr>
       <w:tblGrid>
@@ -1705,7 +2144,7 @@
       </w:tblGrid>
       <w:tr>
         <w:trPr>
-          <w:trHeight w:val="940" w:hRule="exact"/>
+          <w:trHeight w:val="880" w:hRule="exact"/>
           <w:cantSplit/>
         </w:trPr>
         <w:tc>
@@ -1753,7 +2192,7 @@
           </w:p>
           <w:p>
             <w:pPr>
-              <w:spacing w:line="380" w:lineRule="exact" w:after="0" w:before="0"/>
+              <w:spacing w:line="320" w:lineRule="exact" w:after="0" w:before="0"/>
             </w:pPr>
             <w:r>
               <w:rPr>
@@ -1811,7 +2250,7 @@
           </w:p>
           <w:p>
             <w:pPr>
-              <w:spacing w:line="380" w:lineRule="exact" w:after="0" w:before="0"/>
+              <w:spacing w:line="320" w:lineRule="exact" w:after="0" w:before="0"/>
             </w:pPr>
             <w:r>
               <w:rPr>
@@ -1833,12 +2272,12 @@
         <w:tblLayout w:type="fixed"/>
         <w:tblLook w:firstColumn="1" w:firstRow="1" w:lastColumn="0" w:lastRow="0" w:noHBand="0" w:noVBand="1" w:val="04A0"/>
         <w:tblBorders>
-          <w:top w:val="single" w:sz="3" w:color="D8DCE5"/>
-          <w:bottom w:val="single" w:sz="3" w:color="D8DCE5"/>
-          <w:left w:val="single" w:sz="3" w:color="D8DCE5"/>
-          <w:right w:val="single" w:sz="3" w:color="D8DCE5"/>
-          <w:insideV w:val="single" w:sz="3" w:color="D8DCE5"/>
-          <w:insideH w:val="single" w:sz="3" w:color="D8DCE5"/>
+          <w:top w:val="single" w:sz="3" w:color="9B92A2"/>
+          <w:bottom w:val="single" w:sz="3" w:color="9B92A2"/>
+          <w:left w:val="single" w:sz="3" w:color="9B92A2"/>
+          <w:right w:val="single" w:sz="3" w:color="9B92A2"/>
+          <w:insideV w:val="single" w:sz="3" w:color="9B92A2"/>
+          <w:insideH w:val="single" w:sz="3" w:color="9B92A2"/>
         </w:tblBorders>
       </w:tblPr>
       <w:tblGrid>
@@ -1847,7 +2286,7 @@
       </w:tblGrid>
       <w:tr>
         <w:trPr>
-          <w:trHeight w:val="940" w:hRule="exact"/>
+          <w:trHeight w:val="880" w:hRule="exact"/>
           <w:cantSplit/>
         </w:trPr>
         <w:tc>
@@ -1895,7 +2334,7 @@
           </w:p>
           <w:p>
             <w:pPr>
-              <w:spacing w:line="380" w:lineRule="exact" w:after="0" w:before="0"/>
+              <w:spacing w:line="320" w:lineRule="exact" w:after="0" w:before="0"/>
             </w:pPr>
             <w:r>
               <w:rPr>
@@ -1955,7 +2394,7 @@
           </w:p>
           <w:p>
             <w:pPr>
-              <w:spacing w:line="380" w:lineRule="exact" w:after="0" w:before="0"/>
+              <w:spacing w:line="320" w:lineRule="exact" w:after="0" w:before="0"/>
             </w:pPr>
             <w:r>
               <w:rPr>
@@ -1979,12 +2418,12 @@
         <w:tblLayout w:type="fixed"/>
         <w:tblLook w:firstColumn="1" w:firstRow="1" w:lastColumn="0" w:lastRow="0" w:noHBand="0" w:noVBand="1" w:val="04A0"/>
         <w:tblBorders>
-          <w:top w:val="single" w:sz="3" w:color="D8DCE5"/>
-          <w:bottom w:val="single" w:sz="3" w:color="D8DCE5"/>
-          <w:left w:val="single" w:sz="3" w:color="D8DCE5"/>
-          <w:right w:val="single" w:sz="3" w:color="D8DCE5"/>
-          <w:insideV w:val="single" w:sz="3" w:color="D8DCE5"/>
-          <w:insideH w:val="single" w:sz="3" w:color="D8DCE5"/>
+          <w:top w:val="single" w:sz="3" w:color="9B92A2"/>
+          <w:bottom w:val="single" w:sz="3" w:color="9B92A2"/>
+          <w:left w:val="single" w:sz="3" w:color="9B92A2"/>
+          <w:right w:val="single" w:sz="3" w:color="9B92A2"/>
+          <w:insideV w:val="single" w:sz="3" w:color="9B92A2"/>
+          <w:insideH w:val="single" w:sz="3" w:color="9B92A2"/>
         </w:tblBorders>
       </w:tblPr>
       <w:tblGrid>
@@ -1993,7 +2432,7 @@
       </w:tblGrid>
       <w:tr>
         <w:trPr>
-          <w:trHeight w:val="940" w:hRule="exact"/>
+          <w:trHeight w:val="880" w:hRule="exact"/>
           <w:cantSplit/>
         </w:trPr>
         <w:tc>
@@ -2041,7 +2480,7 @@
           </w:p>
           <w:p>
             <w:pPr>
-              <w:spacing w:line="380" w:lineRule="exact" w:after="0" w:before="0"/>
+              <w:spacing w:line="320" w:lineRule="exact" w:after="0" w:before="0"/>
             </w:pPr>
             <w:r>
               <w:rPr>
@@ -2099,7 +2538,7 @@
           </w:p>
           <w:p>
             <w:pPr>
-              <w:spacing w:line="380" w:lineRule="exact" w:after="0" w:before="0"/>
+              <w:spacing w:line="320" w:lineRule="exact" w:after="0" w:before="0"/>
             </w:pPr>
             <w:r>
               <w:rPr>
@@ -2123,12 +2562,12 @@
         <w:tblLayout w:type="fixed"/>
         <w:tblLook w:firstColumn="1" w:firstRow="1" w:lastColumn="0" w:lastRow="0" w:noHBand="0" w:noVBand="1" w:val="04A0"/>
         <w:tblBorders>
-          <w:top w:val="single" w:sz="3" w:color="D8DCE5"/>
-          <w:bottom w:val="single" w:sz="3" w:color="D8DCE5"/>
-          <w:left w:val="single" w:sz="3" w:color="D8DCE5"/>
-          <w:right w:val="single" w:sz="3" w:color="D8DCE5"/>
-          <w:insideV w:val="single" w:sz="3" w:color="D8DCE5"/>
-          <w:insideH w:val="single" w:sz="3" w:color="D8DCE5"/>
+          <w:top w:val="single" w:sz="3" w:color="9B92A2"/>
+          <w:bottom w:val="single" w:sz="3" w:color="9B92A2"/>
+          <w:left w:val="single" w:sz="3" w:color="9B92A2"/>
+          <w:right w:val="single" w:sz="3" w:color="9B92A2"/>
+          <w:insideV w:val="single" w:sz="3" w:color="9B92A2"/>
+          <w:insideH w:val="single" w:sz="3" w:color="9B92A2"/>
         </w:tblBorders>
       </w:tblPr>
       <w:tblGrid>
@@ -2137,7 +2576,7 @@
       </w:tblGrid>
       <w:tr>
         <w:trPr>
-          <w:trHeight w:val="940" w:hRule="exact"/>
+          <w:trHeight w:val="880" w:hRule="exact"/>
           <w:cantSplit/>
         </w:trPr>
         <w:tc>
@@ -2185,7 +2624,7 @@
           </w:p>
           <w:p>
             <w:pPr>
-              <w:spacing w:line="380" w:lineRule="exact" w:after="0" w:before="0"/>
+              <w:spacing w:line="320" w:lineRule="exact" w:after="0" w:before="0"/>
             </w:pPr>
             <w:r>
               <w:rPr>
@@ -2243,7 +2682,7 @@
           </w:p>
           <w:p>
             <w:pPr>
-              <w:spacing w:line="380" w:lineRule="exact" w:after="0" w:before="0"/>
+              <w:spacing w:line="320" w:lineRule="exact" w:after="0" w:before="0"/>
             </w:pPr>
             <w:r>
               <w:rPr>
@@ -2265,12 +2704,12 @@
         <w:tblLayout w:type="fixed"/>
         <w:tblLook w:firstColumn="1" w:firstRow="1" w:lastColumn="0" w:lastRow="0" w:noHBand="0" w:noVBand="1" w:val="04A0"/>
         <w:tblBorders>
-          <w:top w:val="single" w:sz="3" w:color="D8DCE5"/>
-          <w:bottom w:val="single" w:sz="3" w:color="D8DCE5"/>
-          <w:left w:val="single" w:sz="3" w:color="D8DCE5"/>
-          <w:right w:val="single" w:sz="3" w:color="D8DCE5"/>
-          <w:insideV w:val="single" w:sz="3" w:color="D8DCE5"/>
-          <w:insideH w:val="single" w:sz="3" w:color="D8DCE5"/>
+          <w:top w:val="single" w:sz="3" w:color="9B92A2"/>
+          <w:bottom w:val="single" w:sz="3" w:color="9B92A2"/>
+          <w:left w:val="single" w:sz="3" w:color="9B92A2"/>
+          <w:right w:val="single" w:sz="3" w:color="9B92A2"/>
+          <w:insideV w:val="single" w:sz="3" w:color="9B92A2"/>
+          <w:insideH w:val="single" w:sz="3" w:color="9B92A2"/>
         </w:tblBorders>
       </w:tblPr>
       <w:tblGrid>
@@ -2278,7 +2717,7 @@
       </w:tblGrid>
       <w:tr>
         <w:trPr>
-          <w:trHeight w:val="940" w:hRule="exact"/>
+          <w:trHeight w:val="840" w:hRule="exact"/>
           <w:cantSplit/>
         </w:trPr>
         <w:tc>
@@ -2326,7 +2765,7 @@
           </w:p>
           <w:p>
             <w:pPr>
-              <w:spacing w:line="380" w:lineRule="exact" w:after="0" w:before="0"/>
+              <w:spacing w:line="280" w:lineRule="exact" w:after="0" w:before="0"/>
             </w:pPr>
             <w:r>
               <w:rPr>
@@ -2348,12 +2787,12 @@
         <w:tblLayout w:type="fixed"/>
         <w:tblLook w:firstColumn="1" w:firstRow="1" w:lastColumn="0" w:lastRow="0" w:noHBand="0" w:noVBand="1" w:val="04A0"/>
         <w:tblBorders>
-          <w:top w:val="single" w:sz="3" w:color="D8DCE5"/>
-          <w:bottom w:val="single" w:sz="3" w:color="D8DCE5"/>
-          <w:left w:val="single" w:sz="3" w:color="D8DCE5"/>
-          <w:right w:val="single" w:sz="3" w:color="D8DCE5"/>
-          <w:insideV w:val="single" w:sz="3" w:color="D8DCE5"/>
-          <w:insideH w:val="single" w:sz="3" w:color="D8DCE5"/>
+          <w:top w:val="single" w:sz="3" w:color="9B92A2"/>
+          <w:bottom w:val="single" w:sz="3" w:color="9B92A2"/>
+          <w:left w:val="single" w:sz="3" w:color="9B92A2"/>
+          <w:right w:val="single" w:sz="3" w:color="9B92A2"/>
+          <w:insideV w:val="single" w:sz="3" w:color="9B92A2"/>
+          <w:insideH w:val="single" w:sz="3" w:color="9B92A2"/>
         </w:tblBorders>
       </w:tblPr>
       <w:tblGrid>
@@ -2438,73 +2877,135 @@
         <w:t xml:space="preserve"> </w:t>
       </w:r>
     </w:p>
+    <w:tbl>
+      <w:tblPr>
+        <w:tblW w:type="auto" w:w="0"/>
+        <w:tblLayout w:type="fixed"/>
+        <w:tblLook w:firstColumn="1" w:firstRow="1" w:lastColumn="0" w:lastRow="0" w:noHBand="0" w:noVBand="1" w:val="04A0"/>
+      </w:tblPr>
+      <w:tblGrid>
+        <w:gridCol w:w="4993"/>
+        <w:gridCol w:w="4993"/>
+      </w:tblGrid>
+      <w:tr>
+        <w:tc>
+          <w:tcPr>
+            <w:tcW w:type="dxa" w:w="4993"/>
+          </w:tcPr>
+          <w:p>
+            <w:pPr>
+              <w:spacing w:before="0" w:after="0" w:line="230" w:lineRule="exact"/>
+              <w:jc w:val="left"/>
+            </w:pPr>
+            <w:r>
+              <w:rPr>
+                <w:rFonts w:ascii="Arial" w:hAnsi="Arial" w:cs="Bahij TheSansArabic Plain"/>
+                <w:b w:val="0"/>
+                <w:color w:val="242235"/>
+                <w:sz w:val="16"/>
+              </w:rPr>
+              <w:t>I/We certify that the information above is correct and is provided in the condition that it remains confidential, as well as acknowledging a full understanding of the risks of participating in the investment fund including foreign exchange losses involved in investing, dealing and/or trading in securities and other financial instruments, in addition of receiving the terms and conditions of the investment fund.</w:t>
+            </w:r>
+          </w:p>
+        </w:tc>
+        <w:tc>
+          <w:tcPr>
+            <w:tcW w:type="dxa" w:w="4993"/>
+          </w:tcPr>
+          <w:p>
+            <w:pPr>
+              <w:spacing w:before="0" w:after="0" w:line="260" w:lineRule="exact"/>
+              <w:jc w:val="start"/>
+              <w:bidi/>
+            </w:pPr>
+            <w:r>
+              <w:rPr>
+                <w:rFonts w:ascii="Bahij TheSansArabic Plain" w:hAnsi="Bahij TheSansArabic Plain" w:cs="Bahij TheSansArabic Plain"/>
+                <w:b w:val="0"/>
+                <w:color w:val="242235"/>
+                <w:sz w:val="18"/>
+                <w:rtl/>
+                <w:szCs w:val="18"/>
+              </w:rPr>
+              <w:t>بهذا أقر بصحة البيانات أعلاه وأن شركة إتقان كابيتال سوف تتعامل معها بسرية تامة، كما أقبل جميع المخاطر المصاحبة للاشتراك بصندوق الاستثمار بما فيها الخسائر الناتجة عن تحويل العملات والتعامل و / أو المتاجرة في الأوراق المالية والمعاملات الأخرى، كما أقر باستلامي نسخة من الشروط والأحكام الخاصة بصندوق الاستثمار.</w:t>
+            </w:r>
+          </w:p>
+        </w:tc>
+      </w:tr>
+    </w:tbl>
     <w:p>
       <w:pPr>
-        <w:spacing w:before="0" w:after="0" w:line="260" w:lineRule="exact"/>
-        <w:jc w:val="start"/>
-        <w:bidi/>
-      </w:pPr>
-      <w:r>
-        <w:rPr>
-          <w:rFonts w:ascii="Bahij TheSansArabic Plain" w:hAnsi="Bahij TheSansArabic Plain" w:cs="Bahij TheSansArabic Plain"/>
-          <w:b w:val="0"/>
-          <w:color w:val="242235"/>
-          <w:sz w:val="18"/>
-          <w:rtl/>
-          <w:szCs w:val="18"/>
-        </w:rPr>
-        <w:t>بهذا أقر بصحة البيانات أعلاه وأن شركة إتقان كابيتال سوف تتعامل معها بسرية تامة، كما أقبل جميع المخاطر المصاحبة للاشتراك بصندوق الاستثمار بما فيها الخسائر الناتجة عن تحويل العملات والتعامل و / أو المتاجرة في الأوراق المالية والمعاملات الأخرى، كما أقر باستلامي نسخة من الشروط والأحكام الخاصة بصندوق الاستثمار.</w:t>
-      </w:r>
-    </w:p>
-    <w:p>
-      <w:pPr>
-        <w:spacing w:before="0" w:after="0" w:line="210" w:lineRule="exact"/>
-        <w:jc w:val="left"/>
+        <w:spacing w:line="80" w:lineRule="exact" w:after="0"/>
       </w:pPr>
       <w:r>
         <w:rPr>
           <w:rFonts w:ascii="Arial" w:hAnsi="Arial" w:cs="Bahij TheSansArabic Plain"/>
           <w:b w:val="0"/>
           <w:color w:val="242235"/>
-          <w:sz w:val="16"/>
+          <w:sz w:val="2"/>
         </w:rPr>
-        <w:t>I/We certify that the information above is correct and is provided in the condition that it remains confidential, as well as acknowledging a full understanding of the risks of participating in the investment fund including foreign exchange losses involved in investing, dealing and/or trading in securities and other financial instruments, in addition of receiving the terms and conditions of the investment fund.</w:t>
+        <w:t xml:space="preserve"> </w:t>
       </w:r>
     </w:p>
-    <w:p>
-      <w:pPr>
-        <w:spacing w:before="120" w:after="0" w:line="360" w:lineRule="exact"/>
-        <w:jc w:val="start"/>
-        <w:bidi/>
-      </w:pPr>
-      <w:r>
-        <w:rPr>
-          <w:rFonts w:ascii="Bahij TheSansArabic Plain" w:hAnsi="Bahij TheSansArabic Plain" w:cs="Bahij TheSansArabic Plain"/>
-          <w:b/>
-          <w:color w:val="482563"/>
-          <w:sz w:val="24"/>
-          <w:rtl/>
-          <w:szCs w:val="24"/>
-          <w:bCs/>
-        </w:rPr>
-        <w:t>مقدم الطلب المفوض</w:t>
-      </w:r>
-    </w:p>
-    <w:p>
-      <w:pPr>
-        <w:spacing w:before="0" w:after="0" w:line="260" w:lineRule="exact"/>
-        <w:jc w:val="left"/>
-      </w:pPr>
-      <w:r>
-        <w:rPr>
-          <w:rFonts w:ascii="Arial" w:hAnsi="Arial" w:cs="Bahij TheSansArabic Plain"/>
-          <w:b/>
-          <w:color w:val="656575"/>
-          <w:sz w:val="17"/>
-        </w:rPr>
-        <w:t>Authorized applicant</w:t>
-      </w:r>
-    </w:p>
+    <w:tbl>
+      <w:tblPr>
+        <w:tblW w:type="auto" w:w="0"/>
+        <w:tblLayout w:type="fixed"/>
+        <w:tblLook w:firstColumn="1" w:firstRow="1" w:lastColumn="0" w:lastRow="0" w:noHBand="0" w:noVBand="1" w:val="04A0"/>
+      </w:tblPr>
+      <w:tblGrid>
+        <w:gridCol w:w="4993"/>
+        <w:gridCol w:w="4993"/>
+      </w:tblGrid>
+      <w:tr>
+        <w:tc>
+          <w:tcPr>
+            <w:tcW w:type="dxa" w:w="4993"/>
+            <w:shd w:fill="401D58"/>
+          </w:tcPr>
+          <w:p>
+            <w:pPr>
+              <w:spacing w:before="0" w:after="0" w:line="380" w:lineRule="exact"/>
+              <w:jc w:val="left"/>
+            </w:pPr>
+            <w:r>
+              <w:rPr>
+                <w:rFonts w:ascii="Arial" w:hAnsi="Arial" w:cs="Bahij TheSansArabic Plain"/>
+                <w:b/>
+                <w:color w:val="FFFFFF"/>
+                <w:sz w:val="18"/>
+              </w:rPr>
+              <w:t>Applicant</w:t>
+            </w:r>
+          </w:p>
+        </w:tc>
+        <w:tc>
+          <w:tcPr>
+            <w:tcW w:type="dxa" w:w="4993"/>
+            <w:shd w:fill="401D58"/>
+          </w:tcPr>
+          <w:p>
+            <w:pPr>
+              <w:spacing w:before="0" w:after="0" w:line="380" w:lineRule="exact"/>
+              <w:jc w:val="start"/>
+              <w:bidi/>
+            </w:pPr>
+            <w:r>
+              <w:rPr>
+                <w:rFonts w:ascii="Bahij TheSansArabic Plain" w:hAnsi="Bahij TheSansArabic Plain" w:cs="Bahij TheSansArabic Plain"/>
+                <w:b/>
+                <w:color w:val="FFFFFF"/>
+                <w:sz w:val="21"/>
+                <w:rtl/>
+                <w:szCs w:val="21"/>
+                <w:bCs/>
+              </w:rPr>
+              <w:t>مقدم الطلب</w:t>
+            </w:r>
+          </w:p>
+        </w:tc>
+      </w:tr>
+    </w:tbl>
     <w:p>
       <w:pPr>
         <w:spacing w:line="60" w:lineRule="exact" w:after="0"/>
@@ -2526,12 +3027,12 @@
         <w:tblLayout w:type="fixed"/>
         <w:tblLook w:firstColumn="1" w:firstRow="1" w:lastColumn="0" w:lastRow="0" w:noHBand="0" w:noVBand="1" w:val="04A0"/>
         <w:tblBorders>
-          <w:top w:val="single" w:sz="3" w:color="D8DCE5"/>
-          <w:bottom w:val="single" w:sz="3" w:color="D8DCE5"/>
-          <w:left w:val="single" w:sz="3" w:color="D8DCE5"/>
-          <w:right w:val="single" w:sz="3" w:color="D8DCE5"/>
-          <w:insideV w:val="single" w:sz="3" w:color="D8DCE5"/>
-          <w:insideH w:val="single" w:sz="3" w:color="D8DCE5"/>
+          <w:top w:val="single" w:sz="3" w:color="9B92A2"/>
+          <w:bottom w:val="single" w:sz="3" w:color="9B92A2"/>
+          <w:left w:val="single" w:sz="3" w:color="9B92A2"/>
+          <w:right w:val="single" w:sz="3" w:color="9B92A2"/>
+          <w:insideV w:val="single" w:sz="3" w:color="9B92A2"/>
+          <w:insideH w:val="single" w:sz="3" w:color="9B92A2"/>
         </w:tblBorders>
       </w:tblPr>
       <w:tblGrid>
@@ -2540,7 +3041,7 @@
       </w:tblGrid>
       <w:tr>
         <w:trPr>
-          <w:trHeight w:val="940" w:hRule="exact"/>
+          <w:trHeight w:val="880" w:hRule="exact"/>
           <w:cantSplit/>
         </w:trPr>
         <w:tc>
@@ -2588,7 +3089,7 @@
           </w:p>
           <w:p>
             <w:pPr>
-              <w:spacing w:line="380" w:lineRule="exact" w:after="0" w:before="0"/>
+              <w:spacing w:line="320" w:lineRule="exact" w:after="0" w:before="0"/>
             </w:pPr>
             <w:r>
               <w:rPr>
@@ -2646,7 +3147,7 @@
           </w:p>
           <w:p>
             <w:pPr>
-              <w:spacing w:line="380" w:lineRule="exact" w:after="0" w:before="0"/>
+              <w:spacing w:line="320" w:lineRule="exact" w:after="0" w:before="0"/>
             </w:pPr>
             <w:r>
               <w:rPr>
@@ -2668,12 +3169,12 @@
         <w:tblLayout w:type="fixed"/>
         <w:tblLook w:firstColumn="1" w:firstRow="1" w:lastColumn="0" w:lastRow="0" w:noHBand="0" w:noVBand="1" w:val="04A0"/>
         <w:tblBorders>
-          <w:top w:val="single" w:sz="3" w:color="D8DCE5"/>
-          <w:bottom w:val="single" w:sz="3" w:color="D8DCE5"/>
-          <w:left w:val="single" w:sz="3" w:color="D8DCE5"/>
-          <w:right w:val="single" w:sz="3" w:color="D8DCE5"/>
-          <w:insideV w:val="single" w:sz="3" w:color="D8DCE5"/>
-          <w:insideH w:val="single" w:sz="3" w:color="D8DCE5"/>
+          <w:top w:val="single" w:sz="3" w:color="9B92A2"/>
+          <w:bottom w:val="single" w:sz="3" w:color="9B92A2"/>
+          <w:left w:val="single" w:sz="3" w:color="9B92A2"/>
+          <w:right w:val="single" w:sz="3" w:color="9B92A2"/>
+          <w:insideV w:val="single" w:sz="3" w:color="9B92A2"/>
+          <w:insideH w:val="single" w:sz="3" w:color="9B92A2"/>
         </w:tblBorders>
       </w:tblPr>
       <w:tblGrid>
@@ -2681,7 +3182,7 @@
       </w:tblGrid>
       <w:tr>
         <w:trPr>
-          <w:trHeight w:val="1320" w:hRule="exact"/>
+          <w:trHeight w:val="1100" w:hRule="exact"/>
           <w:cantSplit/>
         </w:trPr>
         <w:tc>
@@ -2729,7 +3230,7 @@
           </w:p>
           <w:p>
             <w:pPr>
-              <w:spacing w:line="760" w:lineRule="exact" w:after="0" w:before="0"/>
+              <w:spacing w:line="540" w:lineRule="exact" w:after="0" w:before="0"/>
             </w:pPr>
             <w:r>
               <w:rPr>
@@ -2758,23 +3259,77 @@
         <w:t xml:space="preserve"> </w:t>
       </w:r>
     </w:p>
+    <w:tbl>
+      <w:tblPr>
+        <w:tblW w:type="auto" w:w="0"/>
+        <w:tblLayout w:type="fixed"/>
+        <w:tblLook w:firstColumn="1" w:firstRow="1" w:lastColumn="0" w:lastRow="0" w:noHBand="0" w:noVBand="1" w:val="04A0"/>
+      </w:tblPr>
+      <w:tblGrid>
+        <w:gridCol w:w="4993"/>
+        <w:gridCol w:w="4993"/>
+      </w:tblGrid>
+      <w:tr>
+        <w:tc>
+          <w:tcPr>
+            <w:tcW w:type="dxa" w:w="4993"/>
+            <w:shd w:fill="401D58"/>
+          </w:tcPr>
+          <w:p>
+            <w:pPr>
+              <w:spacing w:before="0" w:after="0" w:line="380" w:lineRule="exact"/>
+              <w:jc w:val="left"/>
+            </w:pPr>
+            <w:r>
+              <w:rPr>
+                <w:rFonts w:ascii="Arial" w:hAnsi="Arial" w:cs="Bahij TheSansArabic Plain"/>
+                <w:b/>
+                <w:color w:val="FFFFFF"/>
+                <w:sz w:val="18"/>
+              </w:rPr>
+              <w:t>For Company Use Only</w:t>
+            </w:r>
+          </w:p>
+        </w:tc>
+        <w:tc>
+          <w:tcPr>
+            <w:tcW w:type="dxa" w:w="4993"/>
+            <w:shd w:fill="401D58"/>
+          </w:tcPr>
+          <w:p>
+            <w:pPr>
+              <w:spacing w:before="0" w:after="0" w:line="380" w:lineRule="exact"/>
+              <w:jc w:val="start"/>
+              <w:bidi/>
+            </w:pPr>
+            <w:r>
+              <w:rPr>
+                <w:rFonts w:ascii="Bahij TheSansArabic Plain" w:hAnsi="Bahij TheSansArabic Plain" w:cs="Bahij TheSansArabic Plain"/>
+                <w:b/>
+                <w:color w:val="FFFFFF"/>
+                <w:sz w:val="21"/>
+                <w:rtl/>
+                <w:szCs w:val="21"/>
+                <w:bCs/>
+              </w:rPr>
+              <w:t>لاستعمال الشركة فقط</w:t>
+            </w:r>
+          </w:p>
+        </w:tc>
+      </w:tr>
+    </w:tbl>
     <w:p>
       <w:pPr>
-        <w:spacing w:before="0" w:after="0" w:line="260" w:lineRule="exact"/>
-        <w:jc w:val="start"/>
-        <w:bidi/>
+        <w:spacing w:line="60" w:lineRule="exact" w:after="0"/>
       </w:pPr>
       <w:r>
         <w:rPr>
-          <w:rFonts w:ascii="Bahij TheSansArabic Plain" w:hAnsi="Bahij TheSansArabic Plain" w:cs="Bahij TheSansArabic Plain"/>
-          <w:b/>
-          <w:color w:val="482563"/>
-          <w:sz w:val="18"/>
-          <w:rtl/>
-          <w:szCs w:val="18"/>
-          <w:bCs/>
+          <w:rFonts w:ascii="Arial" w:hAnsi="Arial" w:cs="Bahij TheSansArabic Plain"/>
+          <w:b w:val="0"/>
+          <w:color w:val="242235"/>
+          <w:sz w:val="2"/>
         </w:rPr>
-        <w:t>لاستخدام مدير الصندوق فقط | For fund manager use only</w:t>
+        <w:t xml:space="preserve"> </w:t>
       </w:r>
     </w:p>
     <w:p>
@@ -2792,45 +3347,245 @@
           <w:rtl/>
           <w:szCs w:val="17"/>
         </w:rPr>
-        <w:t>التوقيع مطابق ☐    الفرع: __________________    التاريخ: __________________</w:t>
+        <w:t>التوقيع مطابق  ☐   Signature Verified</w:t>
       </w:r>
     </w:p>
-    <w:p>
-      <w:pPr>
-        <w:spacing w:before="0" w:after="0" w:line="300" w:lineRule="exact"/>
-        <w:jc w:val="start"/>
-        <w:bidi/>
-      </w:pPr>
-      <w:r>
-        <w:rPr>
-          <w:rFonts w:ascii="Bahij TheSansArabic Plain" w:hAnsi="Bahij TheSansArabic Plain" w:cs="Bahij TheSansArabic Plain"/>
-          <w:b w:val="0"/>
-          <w:color w:val="242235"/>
-          <w:sz w:val="17"/>
-          <w:rtl/>
-          <w:szCs w:val="17"/>
-        </w:rPr>
-        <w:t>مدير الحساب وتوقيعه: __________________    مدخل الطلب وتوقيعه: __________________</w:t>
-      </w:r>
-    </w:p>
-    <w:p>
-      <w:pPr>
-        <w:spacing w:before="0" w:after="0" w:line="300" w:lineRule="exact"/>
-        <w:jc w:val="start"/>
-        <w:bidi/>
-      </w:pPr>
-      <w:r>
-        <w:rPr>
-          <w:rFonts w:ascii="Bahij TheSansArabic Plain" w:hAnsi="Bahij TheSansArabic Plain" w:cs="Bahij TheSansArabic Plain"/>
-          <w:b w:val="0"/>
-          <w:color w:val="242235"/>
-          <w:sz w:val="17"/>
-          <w:rtl/>
-          <w:szCs w:val="17"/>
-        </w:rPr>
-        <w:t>المراجع والمعتمد وتوقيعه: __________________</w:t>
-      </w:r>
-    </w:p>
+    <w:tbl>
+      <w:tblPr>
+        <w:tblW w:type="auto" w:w="0"/>
+        <w:tblLayout w:type="fixed"/>
+        <w:tblLook w:firstColumn="1" w:firstRow="1" w:lastColumn="0" w:lastRow="0" w:noHBand="0" w:noVBand="1" w:val="04A0"/>
+      </w:tblPr>
+      <w:tblGrid>
+        <w:gridCol w:w="4993"/>
+        <w:gridCol w:w="4993"/>
+      </w:tblGrid>
+      <w:tr>
+        <w:tc>
+          <w:tcPr>
+            <w:tcW w:type="dxa" w:w="4993"/>
+          </w:tcPr>
+          <w:p>
+            <w:pPr>
+              <w:spacing w:before="0" w:after="0" w:line="360" w:lineRule="exact"/>
+              <w:jc w:val="start"/>
+              <w:bidi/>
+            </w:pPr>
+            <w:r>
+              <w:rPr>
+                <w:rFonts w:ascii="Bahij TheSansArabic Plain" w:hAnsi="Bahij TheSansArabic Plain" w:cs="Bahij TheSansArabic Plain"/>
+                <w:b w:val="0"/>
+                <w:color w:val="242235"/>
+                <w:sz w:val="16"/>
+                <w:rtl/>
+                <w:szCs w:val="16"/>
+              </w:rPr>
+              <w:t>Date / التاريخ  __________________</w:t>
+            </w:r>
+          </w:p>
+        </w:tc>
+        <w:tc>
+          <w:tcPr>
+            <w:tcW w:type="dxa" w:w="4993"/>
+          </w:tcPr>
+          <w:p>
+            <w:pPr>
+              <w:spacing w:before="0" w:after="0" w:line="360" w:lineRule="exact"/>
+              <w:jc w:val="start"/>
+              <w:bidi/>
+            </w:pPr>
+            <w:r>
+              <w:rPr>
+                <w:rFonts w:ascii="Bahij TheSansArabic Plain" w:hAnsi="Bahij TheSansArabic Plain" w:cs="Bahij TheSansArabic Plain"/>
+                <w:b w:val="0"/>
+                <w:color w:val="242235"/>
+                <w:sz w:val="16"/>
+                <w:rtl/>
+                <w:szCs w:val="16"/>
+              </w:rPr>
+              <w:t>Branch / الفرع  __________________</w:t>
+            </w:r>
+          </w:p>
+        </w:tc>
+      </w:tr>
+    </w:tbl>
+    <w:tbl>
+      <w:tblPr>
+        <w:tblW w:type="auto" w:w="0"/>
+        <w:tblLayout w:type="fixed"/>
+        <w:tblLook w:firstColumn="1" w:firstRow="1" w:lastColumn="0" w:lastRow="0" w:noHBand="0" w:noVBand="1" w:val="04A0"/>
+      </w:tblPr>
+      <w:tblGrid>
+        <w:gridCol w:w="4993"/>
+        <w:gridCol w:w="4993"/>
+      </w:tblGrid>
+      <w:tr>
+        <w:tc>
+          <w:tcPr>
+            <w:tcW w:type="dxa" w:w="4993"/>
+          </w:tcPr>
+          <w:p>
+            <w:pPr>
+              <w:spacing w:before="0" w:after="0" w:line="360" w:lineRule="exact"/>
+              <w:jc w:val="start"/>
+              <w:bidi/>
+            </w:pPr>
+            <w:r>
+              <w:rPr>
+                <w:rFonts w:ascii="Bahij TheSansArabic Plain" w:hAnsi="Bahij TheSansArabic Plain" w:cs="Bahij TheSansArabic Plain"/>
+                <w:b w:val="0"/>
+                <w:color w:val="242235"/>
+                <w:sz w:val="16"/>
+                <w:rtl/>
+                <w:szCs w:val="16"/>
+              </w:rPr>
+              <w:t>Signature / التوقيع  __________________</w:t>
+            </w:r>
+          </w:p>
+        </w:tc>
+        <w:tc>
+          <w:tcPr>
+            <w:tcW w:type="dxa" w:w="4993"/>
+          </w:tcPr>
+          <w:p>
+            <w:pPr>
+              <w:spacing w:before="0" w:after="0" w:line="360" w:lineRule="exact"/>
+              <w:jc w:val="start"/>
+              <w:bidi/>
+            </w:pPr>
+            <w:r>
+              <w:rPr>
+                <w:rFonts w:ascii="Bahij TheSansArabic Plain" w:hAnsi="Bahij TheSansArabic Plain" w:cs="Bahij TheSansArabic Plain"/>
+                <w:b w:val="0"/>
+                <w:color w:val="242235"/>
+                <w:sz w:val="16"/>
+                <w:rtl/>
+                <w:szCs w:val="16"/>
+              </w:rPr>
+              <w:t>A/C Mgr. / مسؤول الحساب  __________________</w:t>
+            </w:r>
+          </w:p>
+        </w:tc>
+      </w:tr>
+    </w:tbl>
+    <w:tbl>
+      <w:tblPr>
+        <w:tblW w:type="auto" w:w="0"/>
+        <w:tblLayout w:type="fixed"/>
+        <w:tblLook w:firstColumn="1" w:firstRow="1" w:lastColumn="0" w:lastRow="0" w:noHBand="0" w:noVBand="1" w:val="04A0"/>
+      </w:tblPr>
+      <w:tblGrid>
+        <w:gridCol w:w="4993"/>
+        <w:gridCol w:w="4993"/>
+      </w:tblGrid>
+      <w:tr>
+        <w:tc>
+          <w:tcPr>
+            <w:tcW w:type="dxa" w:w="4993"/>
+          </w:tcPr>
+          <w:p>
+            <w:pPr>
+              <w:spacing w:before="0" w:after="0" w:line="360" w:lineRule="exact"/>
+              <w:jc w:val="start"/>
+              <w:bidi/>
+            </w:pPr>
+            <w:r>
+              <w:rPr>
+                <w:rFonts w:ascii="Bahij TheSansArabic Plain" w:hAnsi="Bahij TheSansArabic Plain" w:cs="Bahij TheSansArabic Plain"/>
+                <w:b w:val="0"/>
+                <w:color w:val="242235"/>
+                <w:sz w:val="16"/>
+                <w:rtl/>
+                <w:szCs w:val="16"/>
+              </w:rPr>
+              <w:t>Signature / التوقيع  __________________</w:t>
+            </w:r>
+          </w:p>
+        </w:tc>
+        <w:tc>
+          <w:tcPr>
+            <w:tcW w:type="dxa" w:w="4993"/>
+          </w:tcPr>
+          <w:p>
+            <w:pPr>
+              <w:spacing w:before="0" w:after="0" w:line="360" w:lineRule="exact"/>
+              <w:jc w:val="start"/>
+              <w:bidi/>
+            </w:pPr>
+            <w:r>
+              <w:rPr>
+                <w:rFonts w:ascii="Bahij TheSansArabic Plain" w:hAnsi="Bahij TheSansArabic Plain" w:cs="Bahij TheSansArabic Plain"/>
+                <w:b w:val="0"/>
+                <w:color w:val="242235"/>
+                <w:sz w:val="16"/>
+                <w:rtl/>
+                <w:szCs w:val="16"/>
+              </w:rPr>
+              <w:t>Entered by / مدخل الطلب  __________________</w:t>
+            </w:r>
+          </w:p>
+        </w:tc>
+      </w:tr>
+    </w:tbl>
+    <w:tbl>
+      <w:tblPr>
+        <w:tblW w:type="auto" w:w="0"/>
+        <w:tblLayout w:type="fixed"/>
+        <w:tblLook w:firstColumn="1" w:firstRow="1" w:lastColumn="0" w:lastRow="0" w:noHBand="0" w:noVBand="1" w:val="04A0"/>
+      </w:tblPr>
+      <w:tblGrid>
+        <w:gridCol w:w="4993"/>
+        <w:gridCol w:w="4993"/>
+      </w:tblGrid>
+      <w:tr>
+        <w:tc>
+          <w:tcPr>
+            <w:tcW w:type="dxa" w:w="4993"/>
+          </w:tcPr>
+          <w:p>
+            <w:pPr>
+              <w:spacing w:before="0" w:after="0" w:line="360" w:lineRule="exact"/>
+              <w:jc w:val="start"/>
+              <w:bidi/>
+            </w:pPr>
+            <w:r>
+              <w:rPr>
+                <w:rFonts w:ascii="Bahij TheSansArabic Plain" w:hAnsi="Bahij TheSansArabic Plain" w:cs="Bahij TheSansArabic Plain"/>
+                <w:b w:val="0"/>
+                <w:color w:val="242235"/>
+                <w:sz w:val="16"/>
+                <w:rtl/>
+                <w:szCs w:val="16"/>
+              </w:rPr>
+              <w:t>Signature / التوقيع  __________________</w:t>
+            </w:r>
+          </w:p>
+        </w:tc>
+        <w:tc>
+          <w:tcPr>
+            <w:tcW w:type="dxa" w:w="4993"/>
+          </w:tcPr>
+          <w:p>
+            <w:pPr>
+              <w:spacing w:before="0" w:after="0" w:line="360" w:lineRule="exact"/>
+              <w:jc w:val="start"/>
+              <w:bidi/>
+            </w:pPr>
+            <w:r>
+              <w:rPr>
+                <w:rFonts w:ascii="Bahij TheSansArabic Plain" w:hAnsi="Bahij TheSansArabic Plain" w:cs="Bahij TheSansArabic Plain"/>
+                <w:b w:val="0"/>
+                <w:color w:val="242235"/>
+                <w:sz w:val="16"/>
+                <w:rtl/>
+                <w:szCs w:val="16"/>
+              </w:rPr>
+              <w:t>Rev. &amp; approved by / مراجعة واعتماد  __________________</w:t>
+            </w:r>
+          </w:p>
+        </w:tc>
+      </w:tr>
+    </w:tbl>
     <w:sectPr>
       <w:footerReference w:type="default" r:id="rId9"/>
       <w:pgSz w:w="11906" w:h="16838"/>
@@ -3638,9 +4393,6 @@
     <w:qFormat/>
     <w:rsid w:val="00FC693F"/>
     <w:pPr>
-      <w:pBdr>
-        <w:bottom w:val="single" w:sz="8" w:space="4" w:color="4F81BD" w:themeColor="accent1"/>
-      </w:pBdr>
       <w:spacing w:after="300" w:line="240" w:lineRule="auto"/>
       <w:contextualSpacing/>
     </w:pPr>

</xml_diff>